<commit_message>
Super Documento SICOM v1.1 - Anexos completos: Infraestructura, Vulnerabilidades, Contingencias, Aranda, Encuestas
</commit_message>
<xml_diff>
--- a/PROYECTO-002-2026-SICOM/Super_Documento_SICOM.docx
+++ b/PROYECTO-002-2026-SICOM/Super_Documento_SICOM.docx
@@ -28,7 +28,7 @@
         </w:p>
       </w:sdtContent>
     </w:sdt>
-    <w:bookmarkStart w:id="97" w:name="Xb8d68de061527f8697c4f5bcbda320515f6bafa"/>
+    <w:bookmarkStart w:id="104" w:name="Xb8d68de061527f8697c4f5bcbda320515f6bafa"/>
     <w:p>
       <w:pPr>
         <w:pStyle w:val="Heading1"/>
@@ -10565,6 +10565,36 @@
             </w:pPr>
             <w:r>
               <w:t xml:space="preserve">Código único de 6 dígitos asignado a cada agente autorizado</w:t>
+            </w:r>
+          </w:p>
+        </w:tc>
+      </w:tr>
+      <w:tr>
+        <w:tc>
+          <w:tcPr/>
+          <w:p>
+            <w:pPr>
+              <w:pStyle w:val="Compact"/>
+              <w:jc w:val="left"/>
+            </w:pPr>
+            <w:r>
+              <w:rPr>
+                <w:bCs/>
+                <w:b/>
+              </w:rPr>
+              <w:t xml:space="preserve">Contingencia</w:t>
+            </w:r>
+          </w:p>
+        </w:tc>
+        <w:tc>
+          <w:tcPr/>
+          <w:p>
+            <w:pPr>
+              <w:pStyle w:val="Compact"/>
+              <w:jc w:val="left"/>
+            </w:pPr>
+            <w:r>
+              <w:t xml:space="preserve">Plan temporal de abastecimiento ante eventualidades</w:t>
             </w:r>
           </w:p>
         </w:tc>
@@ -13080,6 +13110,3213 @@
         </w:pict>
       </w:r>
     </w:p>
+    <w:bookmarkEnd w:id="96"/>
+    <w:bookmarkStart w:id="99" w:name="anexo-c-activos-de-infraestructura-sicom"/>
+    <w:p>
+      <w:pPr>
+        <w:pStyle w:val="Heading2"/>
+      </w:pPr>
+      <w:r>
+        <w:t xml:space="preserve">ANEXO C: ACTIVOS DE INFRAESTRUCTURA SICOM</w:t>
+      </w:r>
+    </w:p>
+    <w:bookmarkStart w:id="97" w:name="ips-internas-red-sicom"/>
+    <w:p>
+      <w:pPr>
+        <w:pStyle w:val="Heading3"/>
+      </w:pPr>
+      <w:r>
+        <w:t xml:space="preserve">IPs Internas (Red SICOM)</w:t>
+      </w:r>
+    </w:p>
+    <w:tbl>
+      <w:tblPr>
+        <w:tblStyle w:val="Table"/>
+        <w:tblW w:type="auto" w:w="0"/>
+        <w:tblLook w:firstRow="1" w:lastRow="0" w:firstColumn="0" w:lastColumn="0" w:noHBand="0" w:noVBand="0" w:val="0020"/>
+        <w:jc w:val="start"/>
+      </w:tblPr>
+      <w:tblGrid>
+        <w:gridCol w:w="2640"/>
+        <w:gridCol w:w="2640"/>
+        <w:gridCol w:w="2640"/>
+      </w:tblGrid>
+      <w:tr>
+        <w:trPr>
+          <w:tblHeader w:val="true"/>
+        </w:trPr>
+        <w:tc>
+          <w:tcPr/>
+          <w:p>
+            <w:pPr>
+              <w:pStyle w:val="Compact"/>
+              <w:jc w:val="left"/>
+            </w:pPr>
+            <w:r>
+              <w:t xml:space="preserve">No.</w:t>
+            </w:r>
+          </w:p>
+        </w:tc>
+        <w:tc>
+          <w:tcPr/>
+          <w:p>
+            <w:pPr>
+              <w:pStyle w:val="Compact"/>
+              <w:jc w:val="left"/>
+            </w:pPr>
+            <w:r>
+              <w:t xml:space="preserve">IP</w:t>
+            </w:r>
+          </w:p>
+        </w:tc>
+        <w:tc>
+          <w:tcPr/>
+          <w:p>
+            <w:pPr>
+              <w:pStyle w:val="Compact"/>
+              <w:jc w:val="left"/>
+            </w:pPr>
+            <w:r>
+              <w:t xml:space="preserve">Responsable</w:t>
+            </w:r>
+          </w:p>
+        </w:tc>
+      </w:tr>
+      <w:tr>
+        <w:tc>
+          <w:tcPr/>
+          <w:p>
+            <w:pPr>
+              <w:pStyle w:val="Compact"/>
+              <w:jc w:val="left"/>
+            </w:pPr>
+            <w:r>
+              <w:t xml:space="preserve">1</w:t>
+            </w:r>
+          </w:p>
+        </w:tc>
+        <w:tc>
+          <w:tcPr/>
+          <w:p>
+            <w:pPr>
+              <w:pStyle w:val="Compact"/>
+              <w:jc w:val="left"/>
+            </w:pPr>
+            <w:r>
+              <w:t xml:space="preserve">192.168.76.131</w:t>
+            </w:r>
+          </w:p>
+        </w:tc>
+        <w:tc>
+          <w:tcPr/>
+          <w:p>
+            <w:pPr>
+              <w:pStyle w:val="Compact"/>
+              <w:jc w:val="left"/>
+            </w:pPr>
+            <w:r>
+              <w:t xml:space="preserve">SICOM</w:t>
+            </w:r>
+          </w:p>
+        </w:tc>
+      </w:tr>
+      <w:tr>
+        <w:tc>
+          <w:tcPr/>
+          <w:p>
+            <w:pPr>
+              <w:pStyle w:val="Compact"/>
+              <w:jc w:val="left"/>
+            </w:pPr>
+            <w:r>
+              <w:t xml:space="preserve">2</w:t>
+            </w:r>
+          </w:p>
+        </w:tc>
+        <w:tc>
+          <w:tcPr/>
+          <w:p>
+            <w:pPr>
+              <w:pStyle w:val="Compact"/>
+              <w:jc w:val="left"/>
+            </w:pPr>
+            <w:r>
+              <w:t xml:space="preserve">192.168.76.132</w:t>
+            </w:r>
+          </w:p>
+        </w:tc>
+        <w:tc>
+          <w:tcPr/>
+          <w:p>
+            <w:pPr>
+              <w:pStyle w:val="Compact"/>
+              <w:jc w:val="left"/>
+            </w:pPr>
+            <w:r>
+              <w:t xml:space="preserve">SICOM</w:t>
+            </w:r>
+          </w:p>
+        </w:tc>
+      </w:tr>
+      <w:tr>
+        <w:tc>
+          <w:tcPr/>
+          <w:p>
+            <w:pPr>
+              <w:pStyle w:val="Compact"/>
+              <w:jc w:val="left"/>
+            </w:pPr>
+            <w:r>
+              <w:t xml:space="preserve">3</w:t>
+            </w:r>
+          </w:p>
+        </w:tc>
+        <w:tc>
+          <w:tcPr/>
+          <w:p>
+            <w:pPr>
+              <w:pStyle w:val="Compact"/>
+              <w:jc w:val="left"/>
+            </w:pPr>
+            <w:r>
+              <w:t xml:space="preserve">192.168.76.247</w:t>
+            </w:r>
+          </w:p>
+        </w:tc>
+        <w:tc>
+          <w:tcPr/>
+          <w:p>
+            <w:pPr>
+              <w:pStyle w:val="Compact"/>
+              <w:jc w:val="left"/>
+            </w:pPr>
+            <w:r>
+              <w:t xml:space="preserve">SICOM</w:t>
+            </w:r>
+          </w:p>
+        </w:tc>
+      </w:tr>
+      <w:tr>
+        <w:tc>
+          <w:tcPr/>
+          <w:p>
+            <w:pPr>
+              <w:pStyle w:val="Compact"/>
+              <w:jc w:val="left"/>
+            </w:pPr>
+            <w:r>
+              <w:t xml:space="preserve">4</w:t>
+            </w:r>
+          </w:p>
+        </w:tc>
+        <w:tc>
+          <w:tcPr/>
+          <w:p>
+            <w:pPr>
+              <w:pStyle w:val="Compact"/>
+              <w:jc w:val="left"/>
+            </w:pPr>
+            <w:r>
+              <w:t xml:space="preserve">192.168.76.147</w:t>
+            </w:r>
+          </w:p>
+        </w:tc>
+        <w:tc>
+          <w:tcPr/>
+          <w:p>
+            <w:pPr>
+              <w:pStyle w:val="Compact"/>
+              <w:jc w:val="left"/>
+            </w:pPr>
+            <w:r>
+              <w:t xml:space="preserve">SICOM</w:t>
+            </w:r>
+          </w:p>
+        </w:tc>
+      </w:tr>
+      <w:tr>
+        <w:tc>
+          <w:tcPr/>
+          <w:p>
+            <w:pPr>
+              <w:pStyle w:val="Compact"/>
+              <w:jc w:val="left"/>
+            </w:pPr>
+            <w:r>
+              <w:t xml:space="preserve">5</w:t>
+            </w:r>
+          </w:p>
+        </w:tc>
+        <w:tc>
+          <w:tcPr/>
+          <w:p>
+            <w:pPr>
+              <w:pStyle w:val="Compact"/>
+              <w:jc w:val="left"/>
+            </w:pPr>
+            <w:r>
+              <w:t xml:space="preserve">192.168.76.200</w:t>
+            </w:r>
+          </w:p>
+        </w:tc>
+        <w:tc>
+          <w:tcPr/>
+          <w:p>
+            <w:pPr>
+              <w:pStyle w:val="Compact"/>
+              <w:jc w:val="left"/>
+            </w:pPr>
+            <w:r>
+              <w:t xml:space="preserve">SICOM</w:t>
+            </w:r>
+          </w:p>
+        </w:tc>
+      </w:tr>
+      <w:tr>
+        <w:tc>
+          <w:tcPr/>
+          <w:p>
+            <w:pPr>
+              <w:pStyle w:val="Compact"/>
+              <w:jc w:val="left"/>
+            </w:pPr>
+            <w:r>
+              <w:t xml:space="preserve">6</w:t>
+            </w:r>
+          </w:p>
+        </w:tc>
+        <w:tc>
+          <w:tcPr/>
+          <w:p>
+            <w:pPr>
+              <w:pStyle w:val="Compact"/>
+              <w:jc w:val="left"/>
+            </w:pPr>
+            <w:r>
+              <w:t xml:space="preserve">192.168.77.136</w:t>
+            </w:r>
+          </w:p>
+        </w:tc>
+        <w:tc>
+          <w:tcPr/>
+          <w:p>
+            <w:pPr>
+              <w:pStyle w:val="Compact"/>
+              <w:jc w:val="left"/>
+            </w:pPr>
+            <w:r>
+              <w:t xml:space="preserve">SICOM</w:t>
+            </w:r>
+          </w:p>
+        </w:tc>
+      </w:tr>
+      <w:tr>
+        <w:tc>
+          <w:tcPr/>
+          <w:p>
+            <w:pPr>
+              <w:pStyle w:val="Compact"/>
+              <w:jc w:val="left"/>
+            </w:pPr>
+            <w:r>
+              <w:t xml:space="preserve">7</w:t>
+            </w:r>
+          </w:p>
+        </w:tc>
+        <w:tc>
+          <w:tcPr/>
+          <w:p>
+            <w:pPr>
+              <w:pStyle w:val="Compact"/>
+              <w:jc w:val="left"/>
+            </w:pPr>
+            <w:r>
+              <w:t xml:space="preserve">192.168.76.157</w:t>
+            </w:r>
+          </w:p>
+        </w:tc>
+        <w:tc>
+          <w:tcPr/>
+          <w:p>
+            <w:pPr>
+              <w:pStyle w:val="Compact"/>
+              <w:jc w:val="left"/>
+            </w:pPr>
+            <w:r>
+              <w:t xml:space="preserve">SICOM</w:t>
+            </w:r>
+          </w:p>
+        </w:tc>
+      </w:tr>
+      <w:tr>
+        <w:tc>
+          <w:tcPr/>
+          <w:p>
+            <w:pPr>
+              <w:pStyle w:val="Compact"/>
+              <w:jc w:val="left"/>
+            </w:pPr>
+            <w:r>
+              <w:t xml:space="preserve">8</w:t>
+            </w:r>
+          </w:p>
+        </w:tc>
+        <w:tc>
+          <w:tcPr/>
+          <w:p>
+            <w:pPr>
+              <w:pStyle w:val="Compact"/>
+              <w:jc w:val="left"/>
+            </w:pPr>
+            <w:r>
+              <w:t xml:space="preserve">192.168.76.145</w:t>
+            </w:r>
+          </w:p>
+        </w:tc>
+        <w:tc>
+          <w:tcPr/>
+          <w:p>
+            <w:pPr>
+              <w:pStyle w:val="Compact"/>
+              <w:jc w:val="left"/>
+            </w:pPr>
+            <w:r>
+              <w:t xml:space="preserve">SICOM</w:t>
+            </w:r>
+          </w:p>
+        </w:tc>
+      </w:tr>
+      <w:tr>
+        <w:tc>
+          <w:tcPr/>
+          <w:p>
+            <w:pPr>
+              <w:pStyle w:val="Compact"/>
+              <w:jc w:val="left"/>
+            </w:pPr>
+            <w:r>
+              <w:t xml:space="preserve">9</w:t>
+            </w:r>
+          </w:p>
+        </w:tc>
+        <w:tc>
+          <w:tcPr/>
+          <w:p>
+            <w:pPr>
+              <w:pStyle w:val="Compact"/>
+              <w:jc w:val="left"/>
+            </w:pPr>
+            <w:r>
+              <w:t xml:space="preserve">192.168.76.146</w:t>
+            </w:r>
+          </w:p>
+        </w:tc>
+        <w:tc>
+          <w:tcPr/>
+          <w:p>
+            <w:pPr>
+              <w:pStyle w:val="Compact"/>
+              <w:jc w:val="left"/>
+            </w:pPr>
+            <w:r>
+              <w:t xml:space="preserve">SICOM</w:t>
+            </w:r>
+          </w:p>
+        </w:tc>
+      </w:tr>
+      <w:tr>
+        <w:tc>
+          <w:tcPr/>
+          <w:p>
+            <w:pPr>
+              <w:pStyle w:val="Compact"/>
+              <w:jc w:val="left"/>
+            </w:pPr>
+            <w:r>
+              <w:t xml:space="preserve">10</w:t>
+            </w:r>
+          </w:p>
+        </w:tc>
+        <w:tc>
+          <w:tcPr/>
+          <w:p>
+            <w:pPr>
+              <w:pStyle w:val="Compact"/>
+              <w:jc w:val="left"/>
+            </w:pPr>
+            <w:r>
+              <w:t xml:space="preserve">192.168.76.232</w:t>
+            </w:r>
+          </w:p>
+        </w:tc>
+        <w:tc>
+          <w:tcPr/>
+          <w:p>
+            <w:pPr>
+              <w:pStyle w:val="Compact"/>
+              <w:jc w:val="left"/>
+            </w:pPr>
+            <w:r>
+              <w:t xml:space="preserve">SICOM</w:t>
+            </w:r>
+          </w:p>
+        </w:tc>
+      </w:tr>
+      <w:tr>
+        <w:tc>
+          <w:tcPr/>
+          <w:p>
+            <w:pPr>
+              <w:pStyle w:val="Compact"/>
+              <w:jc w:val="left"/>
+            </w:pPr>
+            <w:r>
+              <w:t xml:space="preserve">11</w:t>
+            </w:r>
+          </w:p>
+        </w:tc>
+        <w:tc>
+          <w:tcPr/>
+          <w:p>
+            <w:pPr>
+              <w:pStyle w:val="Compact"/>
+              <w:jc w:val="left"/>
+            </w:pPr>
+            <w:r>
+              <w:t xml:space="preserve">192.168.77.100</w:t>
+            </w:r>
+          </w:p>
+        </w:tc>
+        <w:tc>
+          <w:tcPr/>
+          <w:p>
+            <w:pPr>
+              <w:pStyle w:val="Compact"/>
+              <w:jc w:val="left"/>
+            </w:pPr>
+            <w:r>
+              <w:t xml:space="preserve">SICOM</w:t>
+            </w:r>
+          </w:p>
+        </w:tc>
+      </w:tr>
+      <w:tr>
+        <w:tc>
+          <w:tcPr/>
+          <w:p>
+            <w:pPr>
+              <w:pStyle w:val="Compact"/>
+              <w:jc w:val="left"/>
+            </w:pPr>
+            <w:r>
+              <w:t xml:space="preserve">12</w:t>
+            </w:r>
+          </w:p>
+        </w:tc>
+        <w:tc>
+          <w:tcPr/>
+          <w:p>
+            <w:pPr>
+              <w:pStyle w:val="Compact"/>
+              <w:jc w:val="left"/>
+            </w:pPr>
+            <w:r>
+              <w:t xml:space="preserve">192.168.77.101</w:t>
+            </w:r>
+          </w:p>
+        </w:tc>
+        <w:tc>
+          <w:tcPr/>
+          <w:p>
+            <w:pPr>
+              <w:pStyle w:val="Compact"/>
+              <w:jc w:val="left"/>
+            </w:pPr>
+            <w:r>
+              <w:t xml:space="preserve">SICOM</w:t>
+            </w:r>
+          </w:p>
+        </w:tc>
+      </w:tr>
+      <w:tr>
+        <w:tc>
+          <w:tcPr/>
+          <w:p>
+            <w:pPr>
+              <w:pStyle w:val="Compact"/>
+              <w:jc w:val="left"/>
+            </w:pPr>
+            <w:r>
+              <w:t xml:space="preserve">13</w:t>
+            </w:r>
+          </w:p>
+        </w:tc>
+        <w:tc>
+          <w:tcPr/>
+          <w:p>
+            <w:pPr>
+              <w:pStyle w:val="Compact"/>
+              <w:jc w:val="left"/>
+            </w:pPr>
+            <w:r>
+              <w:t xml:space="preserve">192.168.76.254</w:t>
+            </w:r>
+          </w:p>
+        </w:tc>
+        <w:tc>
+          <w:tcPr/>
+          <w:p>
+            <w:pPr>
+              <w:pStyle w:val="Compact"/>
+              <w:jc w:val="left"/>
+            </w:pPr>
+            <w:r>
+              <w:t xml:space="preserve">SICOM</w:t>
+            </w:r>
+          </w:p>
+        </w:tc>
+      </w:tr>
+      <w:tr>
+        <w:tc>
+          <w:tcPr/>
+          <w:p>
+            <w:pPr>
+              <w:pStyle w:val="Compact"/>
+              <w:jc w:val="left"/>
+            </w:pPr>
+            <w:r>
+              <w:t xml:space="preserve">14</w:t>
+            </w:r>
+          </w:p>
+        </w:tc>
+        <w:tc>
+          <w:tcPr/>
+          <w:p>
+            <w:pPr>
+              <w:pStyle w:val="Compact"/>
+              <w:jc w:val="left"/>
+            </w:pPr>
+            <w:r>
+              <w:t xml:space="preserve">192.168.76.83</w:t>
+            </w:r>
+          </w:p>
+        </w:tc>
+        <w:tc>
+          <w:tcPr/>
+          <w:p>
+            <w:pPr>
+              <w:pStyle w:val="Compact"/>
+              <w:jc w:val="left"/>
+            </w:pPr>
+            <w:r>
+              <w:t xml:space="preserve">SICOM</w:t>
+            </w:r>
+          </w:p>
+        </w:tc>
+      </w:tr>
+      <w:tr>
+        <w:tc>
+          <w:tcPr/>
+          <w:p>
+            <w:pPr>
+              <w:pStyle w:val="Compact"/>
+              <w:jc w:val="left"/>
+            </w:pPr>
+            <w:r>
+              <w:t xml:space="preserve">15</w:t>
+            </w:r>
+          </w:p>
+        </w:tc>
+        <w:tc>
+          <w:tcPr/>
+          <w:p>
+            <w:pPr>
+              <w:pStyle w:val="Compact"/>
+              <w:jc w:val="left"/>
+            </w:pPr>
+            <w:r>
+              <w:t xml:space="preserve">192.168.76.172</w:t>
+            </w:r>
+          </w:p>
+        </w:tc>
+        <w:tc>
+          <w:tcPr/>
+          <w:p>
+            <w:pPr>
+              <w:pStyle w:val="Compact"/>
+              <w:jc w:val="left"/>
+            </w:pPr>
+            <w:r>
+              <w:t xml:space="preserve">SICOM</w:t>
+            </w:r>
+          </w:p>
+        </w:tc>
+      </w:tr>
+      <w:tr>
+        <w:tc>
+          <w:tcPr/>
+          <w:p>
+            <w:pPr>
+              <w:pStyle w:val="Compact"/>
+              <w:jc w:val="left"/>
+            </w:pPr>
+            <w:r>
+              <w:t xml:space="preserve">16</w:t>
+            </w:r>
+          </w:p>
+        </w:tc>
+        <w:tc>
+          <w:tcPr/>
+          <w:p>
+            <w:pPr>
+              <w:pStyle w:val="Compact"/>
+              <w:jc w:val="left"/>
+            </w:pPr>
+            <w:r>
+              <w:t xml:space="preserve">192.168.77.160</w:t>
+            </w:r>
+          </w:p>
+        </w:tc>
+        <w:tc>
+          <w:tcPr/>
+          <w:p>
+            <w:pPr>
+              <w:pStyle w:val="Compact"/>
+              <w:jc w:val="left"/>
+            </w:pPr>
+            <w:r>
+              <w:t xml:space="preserve">SICOM</w:t>
+            </w:r>
+          </w:p>
+        </w:tc>
+      </w:tr>
+      <w:tr>
+        <w:tc>
+          <w:tcPr/>
+          <w:p>
+            <w:pPr>
+              <w:pStyle w:val="Compact"/>
+              <w:jc w:val="left"/>
+            </w:pPr>
+            <w:r>
+              <w:t xml:space="preserve">17</w:t>
+            </w:r>
+          </w:p>
+        </w:tc>
+        <w:tc>
+          <w:tcPr/>
+          <w:p>
+            <w:pPr>
+              <w:pStyle w:val="Compact"/>
+              <w:jc w:val="left"/>
+            </w:pPr>
+            <w:r>
+              <w:t xml:space="preserve">192.168.76.155</w:t>
+            </w:r>
+          </w:p>
+        </w:tc>
+        <w:tc>
+          <w:tcPr/>
+          <w:p>
+            <w:pPr>
+              <w:pStyle w:val="Compact"/>
+              <w:jc w:val="left"/>
+            </w:pPr>
+            <w:r>
+              <w:t xml:space="preserve">SICOM</w:t>
+            </w:r>
+          </w:p>
+        </w:tc>
+      </w:tr>
+      <w:tr>
+        <w:tc>
+          <w:tcPr/>
+          <w:p>
+            <w:pPr>
+              <w:pStyle w:val="Compact"/>
+              <w:jc w:val="left"/>
+            </w:pPr>
+            <w:r>
+              <w:t xml:space="preserve">18</w:t>
+            </w:r>
+          </w:p>
+        </w:tc>
+        <w:tc>
+          <w:tcPr/>
+          <w:p>
+            <w:pPr>
+              <w:pStyle w:val="Compact"/>
+              <w:jc w:val="left"/>
+            </w:pPr>
+            <w:r>
+              <w:t xml:space="preserve">192.168.76.161</w:t>
+            </w:r>
+          </w:p>
+        </w:tc>
+        <w:tc>
+          <w:tcPr/>
+          <w:p>
+            <w:pPr>
+              <w:pStyle w:val="Compact"/>
+              <w:jc w:val="left"/>
+            </w:pPr>
+            <w:r>
+              <w:t xml:space="preserve">SICOM</w:t>
+            </w:r>
+          </w:p>
+        </w:tc>
+      </w:tr>
+      <w:tr>
+        <w:tc>
+          <w:tcPr/>
+          <w:p>
+            <w:pPr>
+              <w:pStyle w:val="Compact"/>
+              <w:jc w:val="left"/>
+            </w:pPr>
+            <w:r>
+              <w:t xml:space="preserve">19</w:t>
+            </w:r>
+          </w:p>
+        </w:tc>
+        <w:tc>
+          <w:tcPr/>
+          <w:p>
+            <w:pPr>
+              <w:pStyle w:val="Compact"/>
+              <w:jc w:val="left"/>
+            </w:pPr>
+            <w:r>
+              <w:t xml:space="preserve">192.168.77.153</w:t>
+            </w:r>
+          </w:p>
+        </w:tc>
+        <w:tc>
+          <w:tcPr/>
+          <w:p>
+            <w:pPr>
+              <w:pStyle w:val="Compact"/>
+              <w:jc w:val="left"/>
+            </w:pPr>
+            <w:r>
+              <w:t xml:space="preserve">SICOM</w:t>
+            </w:r>
+          </w:p>
+        </w:tc>
+      </w:tr>
+      <w:tr>
+        <w:tc>
+          <w:tcPr/>
+          <w:p>
+            <w:pPr>
+              <w:pStyle w:val="Compact"/>
+              <w:jc w:val="left"/>
+            </w:pPr>
+            <w:r>
+              <w:t xml:space="preserve">20</w:t>
+            </w:r>
+          </w:p>
+        </w:tc>
+        <w:tc>
+          <w:tcPr/>
+          <w:p>
+            <w:pPr>
+              <w:pStyle w:val="Compact"/>
+              <w:jc w:val="left"/>
+            </w:pPr>
+            <w:r>
+              <w:t xml:space="preserve">192.168.77.150</w:t>
+            </w:r>
+          </w:p>
+        </w:tc>
+        <w:tc>
+          <w:tcPr/>
+          <w:p>
+            <w:pPr>
+              <w:pStyle w:val="Compact"/>
+              <w:jc w:val="left"/>
+            </w:pPr>
+            <w:r>
+              <w:t xml:space="preserve">SICOM</w:t>
+            </w:r>
+          </w:p>
+        </w:tc>
+      </w:tr>
+      <w:tr>
+        <w:tc>
+          <w:tcPr/>
+          <w:p>
+            <w:pPr>
+              <w:pStyle w:val="Compact"/>
+              <w:jc w:val="left"/>
+            </w:pPr>
+            <w:r>
+              <w:t xml:space="preserve">21</w:t>
+            </w:r>
+          </w:p>
+        </w:tc>
+        <w:tc>
+          <w:tcPr/>
+          <w:p>
+            <w:pPr>
+              <w:pStyle w:val="Compact"/>
+              <w:jc w:val="left"/>
+            </w:pPr>
+            <w:r>
+              <w:t xml:space="preserve">192.168.77.151</w:t>
+            </w:r>
+          </w:p>
+        </w:tc>
+        <w:tc>
+          <w:tcPr/>
+          <w:p>
+            <w:pPr>
+              <w:pStyle w:val="Compact"/>
+              <w:jc w:val="left"/>
+            </w:pPr>
+            <w:r>
+              <w:t xml:space="preserve">SICOM</w:t>
+            </w:r>
+          </w:p>
+        </w:tc>
+      </w:tr>
+      <w:tr>
+        <w:tc>
+          <w:tcPr/>
+          <w:p>
+            <w:pPr>
+              <w:pStyle w:val="Compact"/>
+              <w:jc w:val="left"/>
+            </w:pPr>
+            <w:r>
+              <w:t xml:space="preserve">22</w:t>
+            </w:r>
+          </w:p>
+        </w:tc>
+        <w:tc>
+          <w:tcPr/>
+          <w:p>
+            <w:pPr>
+              <w:pStyle w:val="Compact"/>
+              <w:jc w:val="left"/>
+            </w:pPr>
+            <w:r>
+              <w:t xml:space="preserve">10.158.2.131</w:t>
+            </w:r>
+          </w:p>
+        </w:tc>
+        <w:tc>
+          <w:tcPr/>
+          <w:p>
+            <w:pPr>
+              <w:pStyle w:val="Compact"/>
+              <w:jc w:val="left"/>
+            </w:pPr>
+            <w:r>
+              <w:t xml:space="preserve">SICOM</w:t>
+            </w:r>
+          </w:p>
+        </w:tc>
+      </w:tr>
+      <w:tr>
+        <w:tc>
+          <w:tcPr/>
+          <w:p>
+            <w:pPr>
+              <w:pStyle w:val="Compact"/>
+              <w:jc w:val="left"/>
+            </w:pPr>
+            <w:r>
+              <w:t xml:space="preserve">23</w:t>
+            </w:r>
+          </w:p>
+        </w:tc>
+        <w:tc>
+          <w:tcPr/>
+          <w:p>
+            <w:pPr>
+              <w:pStyle w:val="Compact"/>
+              <w:jc w:val="left"/>
+            </w:pPr>
+            <w:r>
+              <w:t xml:space="preserve">192.168.76.156</w:t>
+            </w:r>
+          </w:p>
+        </w:tc>
+        <w:tc>
+          <w:tcPr/>
+          <w:p>
+            <w:pPr>
+              <w:pStyle w:val="Compact"/>
+              <w:jc w:val="left"/>
+            </w:pPr>
+            <w:r>
+              <w:t xml:space="preserve">SICOM</w:t>
+            </w:r>
+          </w:p>
+        </w:tc>
+      </w:tr>
+      <w:tr>
+        <w:tc>
+          <w:tcPr/>
+          <w:p>
+            <w:pPr>
+              <w:pStyle w:val="Compact"/>
+              <w:jc w:val="left"/>
+            </w:pPr>
+            <w:r>
+              <w:t xml:space="preserve">24</w:t>
+            </w:r>
+          </w:p>
+        </w:tc>
+        <w:tc>
+          <w:tcPr/>
+          <w:p>
+            <w:pPr>
+              <w:pStyle w:val="Compact"/>
+              <w:jc w:val="left"/>
+            </w:pPr>
+            <w:r>
+              <w:t xml:space="preserve">192.168.76.129</w:t>
+            </w:r>
+          </w:p>
+        </w:tc>
+        <w:tc>
+          <w:tcPr/>
+          <w:p>
+            <w:pPr>
+              <w:pStyle w:val="Compact"/>
+              <w:jc w:val="left"/>
+            </w:pPr>
+            <w:r>
+              <w:t xml:space="preserve">SICOM</w:t>
+            </w:r>
+          </w:p>
+        </w:tc>
+      </w:tr>
+      <w:tr>
+        <w:tc>
+          <w:tcPr/>
+          <w:p>
+            <w:pPr>
+              <w:pStyle w:val="Compact"/>
+              <w:jc w:val="left"/>
+            </w:pPr>
+            <w:r>
+              <w:t xml:space="preserve">25</w:t>
+            </w:r>
+          </w:p>
+        </w:tc>
+        <w:tc>
+          <w:tcPr/>
+          <w:p>
+            <w:pPr>
+              <w:pStyle w:val="Compact"/>
+              <w:jc w:val="left"/>
+            </w:pPr>
+            <w:r>
+              <w:t xml:space="preserve">192.168.76.190</w:t>
+            </w:r>
+          </w:p>
+        </w:tc>
+        <w:tc>
+          <w:tcPr/>
+          <w:p>
+            <w:pPr>
+              <w:pStyle w:val="Compact"/>
+              <w:jc w:val="left"/>
+            </w:pPr>
+            <w:r>
+              <w:t xml:space="preserve">SICOM</w:t>
+            </w:r>
+          </w:p>
+        </w:tc>
+      </w:tr>
+      <w:tr>
+        <w:tc>
+          <w:tcPr/>
+          <w:p>
+            <w:pPr>
+              <w:pStyle w:val="Compact"/>
+              <w:jc w:val="left"/>
+            </w:pPr>
+            <w:r>
+              <w:t xml:space="preserve">26</w:t>
+            </w:r>
+          </w:p>
+        </w:tc>
+        <w:tc>
+          <w:tcPr/>
+          <w:p>
+            <w:pPr>
+              <w:pStyle w:val="Compact"/>
+              <w:jc w:val="left"/>
+            </w:pPr>
+            <w:r>
+              <w:t xml:space="preserve">192.168.77.191</w:t>
+            </w:r>
+          </w:p>
+        </w:tc>
+        <w:tc>
+          <w:tcPr/>
+          <w:p>
+            <w:pPr>
+              <w:pStyle w:val="Compact"/>
+              <w:jc w:val="left"/>
+            </w:pPr>
+            <w:r>
+              <w:t xml:space="preserve">SICOM</w:t>
+            </w:r>
+          </w:p>
+        </w:tc>
+      </w:tr>
+      <w:tr>
+        <w:tc>
+          <w:tcPr/>
+          <w:p>
+            <w:pPr>
+              <w:pStyle w:val="Compact"/>
+              <w:jc w:val="left"/>
+            </w:pPr>
+            <w:r>
+              <w:t xml:space="preserve">27</w:t>
+            </w:r>
+          </w:p>
+        </w:tc>
+        <w:tc>
+          <w:tcPr/>
+          <w:p>
+            <w:pPr>
+              <w:pStyle w:val="Compact"/>
+              <w:jc w:val="left"/>
+            </w:pPr>
+            <w:r>
+              <w:t xml:space="preserve">10.158.3.110</w:t>
+            </w:r>
+          </w:p>
+        </w:tc>
+        <w:tc>
+          <w:tcPr/>
+          <w:p>
+            <w:pPr>
+              <w:pStyle w:val="Compact"/>
+              <w:jc w:val="left"/>
+            </w:pPr>
+            <w:r>
+              <w:t xml:space="preserve">SICOM</w:t>
+            </w:r>
+          </w:p>
+        </w:tc>
+      </w:tr>
+    </w:tbl>
+    <w:p>
+      <w:pPr>
+        <w:pStyle w:val="BodyText"/>
+      </w:pPr>
+      <w:r>
+        <w:rPr>
+          <w:bCs/>
+          <w:b/>
+        </w:rPr>
+        <w:t xml:space="preserve">Total dispositivos analizados:</w:t>
+      </w:r>
+      <w:r>
+        <w:t xml:space="preserve"> </w:t>
+      </w:r>
+      <w:r>
+        <w:t xml:space="preserve">54</w:t>
+      </w:r>
+    </w:p>
+    <w:bookmarkEnd w:id="97"/>
+    <w:bookmarkStart w:id="98" w:name="urls-externas-sicom"/>
+    <w:p>
+      <w:pPr>
+        <w:pStyle w:val="Heading3"/>
+      </w:pPr>
+      <w:r>
+        <w:t xml:space="preserve">URLs Externas SICOM</w:t>
+      </w:r>
+    </w:p>
+    <w:tbl>
+      <w:tblPr>
+        <w:tblStyle w:val="Table"/>
+        <w:tblW w:type="pct" w:w="5000"/>
+        <w:tblLook w:firstRow="1" w:lastRow="0" w:firstColumn="0" w:lastColumn="0" w:noHBand="0" w:noVBand="0" w:val="0020"/>
+        <w:jc w:val="start"/>
+      </w:tblPr>
+      <w:tblGrid>
+        <w:gridCol w:w="1980"/>
+        <w:gridCol w:w="1980"/>
+        <w:gridCol w:w="3960"/>
+      </w:tblGrid>
+      <w:tr>
+        <w:trPr>
+          <w:tblHeader w:val="true"/>
+        </w:trPr>
+        <w:tc>
+          <w:tcPr/>
+          <w:p>
+            <w:pPr>
+              <w:pStyle w:val="Compact"/>
+              <w:jc w:val="left"/>
+            </w:pPr>
+            <w:r>
+              <w:t xml:space="preserve">No.</w:t>
+            </w:r>
+          </w:p>
+        </w:tc>
+        <w:tc>
+          <w:tcPr/>
+          <w:p>
+            <w:pPr>
+              <w:pStyle w:val="Compact"/>
+              <w:jc w:val="left"/>
+            </w:pPr>
+            <w:r>
+              <w:t xml:space="preserve">URL</w:t>
+            </w:r>
+          </w:p>
+        </w:tc>
+        <w:tc>
+          <w:tcPr/>
+          <w:p>
+            <w:pPr>
+              <w:pStyle w:val="Compact"/>
+              <w:jc w:val="left"/>
+            </w:pPr>
+            <w:r>
+              <w:t xml:space="preserve">Servicio</w:t>
+            </w:r>
+          </w:p>
+        </w:tc>
+      </w:tr>
+      <w:tr>
+        <w:tc>
+          <w:tcPr/>
+          <w:p>
+            <w:pPr>
+              <w:pStyle w:val="Compact"/>
+              <w:jc w:val="left"/>
+            </w:pPr>
+            <w:r>
+              <w:t xml:space="preserve">1</w:t>
+            </w:r>
+          </w:p>
+        </w:tc>
+        <w:tc>
+          <w:tcPr/>
+          <w:p>
+            <w:pPr>
+              <w:pStyle w:val="Compact"/>
+              <w:jc w:val="left"/>
+            </w:pPr>
+            <w:r>
+              <w:t xml:space="preserve">https://www.sicom.gov.co/</w:t>
+            </w:r>
+          </w:p>
+        </w:tc>
+        <w:tc>
+          <w:tcPr/>
+          <w:p>
+            <w:pPr>
+              <w:pStyle w:val="Compact"/>
+              <w:jc w:val="left"/>
+            </w:pPr>
+            <w:r>
+              <w:t xml:space="preserve">Portal Web</w:t>
+            </w:r>
+          </w:p>
+        </w:tc>
+      </w:tr>
+      <w:tr>
+        <w:tc>
+          <w:tcPr/>
+          <w:p>
+            <w:pPr>
+              <w:pStyle w:val="Compact"/>
+              <w:jc w:val="left"/>
+            </w:pPr>
+            <w:r>
+              <w:t xml:space="preserve">2</w:t>
+            </w:r>
+          </w:p>
+        </w:tc>
+        <w:tc>
+          <w:tcPr/>
+          <w:p>
+            <w:pPr>
+              <w:pStyle w:val="Compact"/>
+              <w:jc w:val="left"/>
+            </w:pPr>
+            <w:r>
+              <w:t xml:space="preserve">https://wss.sicom.gov.co/sicomdata/</w:t>
+            </w:r>
+          </w:p>
+        </w:tc>
+        <w:tc>
+          <w:tcPr/>
+          <w:p>
+            <w:pPr>
+              <w:pStyle w:val="Compact"/>
+              <w:jc w:val="left"/>
+            </w:pPr>
+            <w:r>
+              <w:t xml:space="preserve">Web Service</w:t>
+            </w:r>
+          </w:p>
+        </w:tc>
+      </w:tr>
+      <w:tr>
+        <w:tc>
+          <w:tcPr/>
+          <w:p>
+            <w:pPr>
+              <w:pStyle w:val="Compact"/>
+              <w:jc w:val="left"/>
+            </w:pPr>
+            <w:r>
+              <w:t xml:space="preserve">3</w:t>
+            </w:r>
+          </w:p>
+        </w:tc>
+        <w:tc>
+          <w:tcPr/>
+          <w:p>
+            <w:pPr>
+              <w:pStyle w:val="Compact"/>
+              <w:jc w:val="left"/>
+            </w:pPr>
+            <w:r>
+              <w:t xml:space="preserve">https://eds.sicom.gov.co/eds/api/v1</w:t>
+            </w:r>
+          </w:p>
+        </w:tc>
+        <w:tc>
+          <w:tcPr/>
+          <w:p>
+            <w:pPr>
+              <w:pStyle w:val="Compact"/>
+              <w:jc w:val="left"/>
+            </w:pPr>
+            <w:r>
+              <w:t xml:space="preserve">API EDS</w:t>
+            </w:r>
+          </w:p>
+        </w:tc>
+      </w:tr>
+      <w:tr>
+        <w:tc>
+          <w:tcPr/>
+          <w:p>
+            <w:pPr>
+              <w:pStyle w:val="Compact"/>
+              <w:jc w:val="left"/>
+            </w:pPr>
+            <w:r>
+              <w:t xml:space="preserve">4</w:t>
+            </w:r>
+          </w:p>
+        </w:tc>
+        <w:tc>
+          <w:tcPr/>
+          <w:p>
+            <w:pPr>
+              <w:pStyle w:val="Compact"/>
+              <w:jc w:val="left"/>
+            </w:pPr>
+            <w:r>
+              <w:t xml:space="preserve">https://bi.sicom.gov.co/OLAP/msmdpump.dll</w:t>
+            </w:r>
+          </w:p>
+        </w:tc>
+        <w:tc>
+          <w:tcPr/>
+          <w:p>
+            <w:pPr>
+              <w:pStyle w:val="Compact"/>
+              <w:jc w:val="left"/>
+            </w:pPr>
+            <w:r>
+              <w:t xml:space="preserve">BI OLAP</w:t>
+            </w:r>
+          </w:p>
+        </w:tc>
+      </w:tr>
+      <w:tr>
+        <w:tc>
+          <w:tcPr/>
+          <w:p>
+            <w:pPr>
+              <w:pStyle w:val="Compact"/>
+              <w:jc w:val="left"/>
+            </w:pPr>
+            <w:r>
+              <w:t xml:space="preserve">5</w:t>
+            </w:r>
+          </w:p>
+        </w:tc>
+        <w:tc>
+          <w:tcPr/>
+          <w:p>
+            <w:pPr>
+              <w:pStyle w:val="Compact"/>
+              <w:jc w:val="left"/>
+            </w:pPr>
+            <w:r>
+              <w:t xml:space="preserve">https://bi.sicom.gov.co/OLAP_PRUEBASDLLO/msmdpump.dll</w:t>
+            </w:r>
+          </w:p>
+        </w:tc>
+        <w:tc>
+          <w:tcPr/>
+          <w:p>
+            <w:pPr>
+              <w:pStyle w:val="Compact"/>
+              <w:jc w:val="left"/>
+            </w:pPr>
+            <w:r>
+              <w:t xml:space="preserve">BI Pruebas</w:t>
+            </w:r>
+          </w:p>
+        </w:tc>
+      </w:tr>
+      <w:tr>
+        <w:tc>
+          <w:tcPr/>
+          <w:p>
+            <w:pPr>
+              <w:pStyle w:val="Compact"/>
+              <w:jc w:val="left"/>
+            </w:pPr>
+            <w:r>
+              <w:t xml:space="preserve">6</w:t>
+            </w:r>
+          </w:p>
+        </w:tc>
+        <w:tc>
+          <w:tcPr/>
+          <w:p>
+            <w:pPr>
+              <w:pStyle w:val="Compact"/>
+              <w:jc w:val="left"/>
+            </w:pPr>
+            <w:r>
+              <w:t xml:space="preserve">https://bi.sicom.gov.co/OLAP_GCV/msmdpump.dll</w:t>
+            </w:r>
+          </w:p>
+        </w:tc>
+        <w:tc>
+          <w:tcPr/>
+          <w:p>
+            <w:pPr>
+              <w:pStyle w:val="Compact"/>
+              <w:jc w:val="left"/>
+            </w:pPr>
+            <w:r>
+              <w:t xml:space="preserve">BI GCV</w:t>
+            </w:r>
+          </w:p>
+        </w:tc>
+      </w:tr>
+      <w:tr>
+        <w:tc>
+          <w:tcPr/>
+          <w:p>
+            <w:pPr>
+              <w:pStyle w:val="Compact"/>
+              <w:jc w:val="left"/>
+            </w:pPr>
+            <w:r>
+              <w:t xml:space="preserve">7</w:t>
+            </w:r>
+          </w:p>
+        </w:tc>
+        <w:tc>
+          <w:tcPr/>
+          <w:p>
+            <w:pPr>
+              <w:pStyle w:val="Compact"/>
+              <w:jc w:val="left"/>
+            </w:pPr>
+            <w:r>
+              <w:t xml:space="preserve">https://bi.sicom.gov.co/OLAP_ENTIDADEXT/msmdpump.dll</w:t>
+            </w:r>
+          </w:p>
+        </w:tc>
+        <w:tc>
+          <w:tcPr/>
+          <w:p>
+            <w:pPr>
+              <w:pStyle w:val="Compact"/>
+              <w:jc w:val="left"/>
+            </w:pPr>
+            <w:r>
+              <w:t xml:space="preserve">BI Entidades</w:t>
+            </w:r>
+          </w:p>
+        </w:tc>
+      </w:tr>
+      <w:tr>
+        <w:tc>
+          <w:tcPr/>
+          <w:p>
+            <w:pPr>
+              <w:pStyle w:val="Compact"/>
+              <w:jc w:val="left"/>
+            </w:pPr>
+            <w:r>
+              <w:t xml:space="preserve">8</w:t>
+            </w:r>
+          </w:p>
+        </w:tc>
+        <w:tc>
+          <w:tcPr/>
+          <w:p>
+            <w:pPr>
+              <w:pStyle w:val="Compact"/>
+              <w:jc w:val="left"/>
+            </w:pPr>
+            <w:r>
+              <w:t xml:space="preserve">https://bi.sicom.gov.co/OLAP_EXTERNO/msmdpump.dll</w:t>
+            </w:r>
+          </w:p>
+        </w:tc>
+        <w:tc>
+          <w:tcPr/>
+          <w:p>
+            <w:pPr>
+              <w:pStyle w:val="Compact"/>
+              <w:jc w:val="left"/>
+            </w:pPr>
+            <w:r>
+              <w:t xml:space="preserve">BI Externo</w:t>
+            </w:r>
+          </w:p>
+        </w:tc>
+      </w:tr>
+      <w:tr>
+        <w:tc>
+          <w:tcPr/>
+          <w:p>
+            <w:pPr>
+              <w:pStyle w:val="Compact"/>
+              <w:jc w:val="left"/>
+            </w:pPr>
+            <w:r>
+              <w:t xml:space="preserve">9</w:t>
+            </w:r>
+          </w:p>
+        </w:tc>
+        <w:tc>
+          <w:tcPr/>
+          <w:p>
+            <w:pPr>
+              <w:pStyle w:val="Compact"/>
+              <w:jc w:val="left"/>
+            </w:pPr>
+            <w:r>
+              <w:t xml:space="preserve">https://bi.sicom.gov.co/OLAP_PRUEBAS/msmdpump.dll</w:t>
+            </w:r>
+          </w:p>
+        </w:tc>
+        <w:tc>
+          <w:tcPr/>
+          <w:p>
+            <w:pPr>
+              <w:pStyle w:val="Compact"/>
+              <w:jc w:val="left"/>
+            </w:pPr>
+            <w:r>
+              <w:t xml:space="preserve">BI Pruebas</w:t>
+            </w:r>
+          </w:p>
+        </w:tc>
+      </w:tr>
+      <w:tr>
+        <w:tc>
+          <w:tcPr/>
+          <w:p>
+            <w:pPr>
+              <w:pStyle w:val="Compact"/>
+              <w:jc w:val="left"/>
+            </w:pPr>
+            <w:r>
+              <w:t xml:space="preserve">10</w:t>
+            </w:r>
+          </w:p>
+        </w:tc>
+        <w:tc>
+          <w:tcPr/>
+          <w:p>
+            <w:pPr>
+              <w:pStyle w:val="Compact"/>
+              <w:jc w:val="left"/>
+            </w:pPr>
+            <w:r>
+              <w:t xml:space="preserve">https://pruebabi.sicom.gov.co/</w:t>
+            </w:r>
+          </w:p>
+        </w:tc>
+        <w:tc>
+          <w:tcPr/>
+          <w:p>
+            <w:pPr>
+              <w:pStyle w:val="Compact"/>
+              <w:jc w:val="left"/>
+            </w:pPr>
+            <w:r>
+              <w:t xml:space="preserve">Pruebas BI</w:t>
+            </w:r>
+          </w:p>
+        </w:tc>
+      </w:tr>
+      <w:tr>
+        <w:tc>
+          <w:tcPr/>
+          <w:p>
+            <w:pPr>
+              <w:pStyle w:val="Compact"/>
+              <w:jc w:val="left"/>
+            </w:pPr>
+            <w:r>
+              <w:t xml:space="preserve">11</w:t>
+            </w:r>
+          </w:p>
+        </w:tc>
+        <w:tc>
+          <w:tcPr/>
+          <w:p>
+            <w:pPr>
+              <w:pStyle w:val="Compact"/>
+              <w:jc w:val="left"/>
+            </w:pPr>
+            <w:r>
+              <w:t xml:space="preserve">https://portal.sicom.gov.co/SICOM</w:t>
+            </w:r>
+          </w:p>
+        </w:tc>
+        <w:tc>
+          <w:tcPr/>
+          <w:p>
+            <w:pPr>
+              <w:pStyle w:val="Compact"/>
+              <w:jc w:val="left"/>
+            </w:pPr>
+            <w:r>
+              <w:t xml:space="preserve">Portal</w:t>
+            </w:r>
+          </w:p>
+        </w:tc>
+      </w:tr>
+      <w:tr>
+        <w:tc>
+          <w:tcPr/>
+          <w:p>
+            <w:pPr>
+              <w:pStyle w:val="Compact"/>
+              <w:jc w:val="left"/>
+            </w:pPr>
+            <w:r>
+              <w:t xml:space="preserve">12</w:t>
+            </w:r>
+          </w:p>
+        </w:tc>
+        <w:tc>
+          <w:tcPr/>
+          <w:p>
+            <w:pPr>
+              <w:pStyle w:val="Compact"/>
+              <w:jc w:val="left"/>
+            </w:pPr>
+            <w:r>
+              <w:t xml:space="preserve">https://mesadeservicio.sicom.gov.co//USDKv8//#!/login/</w:t>
+            </w:r>
+          </w:p>
+        </w:tc>
+        <w:tc>
+          <w:tcPr/>
+          <w:p>
+            <w:pPr>
+              <w:pStyle w:val="Compact"/>
+              <w:jc w:val="left"/>
+            </w:pPr>
+            <w:r>
+              <w:t xml:space="preserve">Mesa de Servicio</w:t>
+            </w:r>
+          </w:p>
+        </w:tc>
+      </w:tr>
+      <w:tr>
+        <w:tc>
+          <w:tcPr/>
+          <w:p>
+            <w:pPr>
+              <w:pStyle w:val="Compact"/>
+              <w:jc w:val="left"/>
+            </w:pPr>
+            <w:r>
+              <w:t xml:space="preserve">13</w:t>
+            </w:r>
+          </w:p>
+        </w:tc>
+        <w:tc>
+          <w:tcPr/>
+          <w:p>
+            <w:pPr>
+              <w:pStyle w:val="Compact"/>
+              <w:jc w:val="left"/>
+            </w:pPr>
+            <w:r>
+              <w:t xml:space="preserve">https://liquidos.sicom.gov.co/sicom/identificacionAction.do</w:t>
+            </w:r>
+          </w:p>
+        </w:tc>
+        <w:tc>
+          <w:tcPr/>
+          <w:p>
+            <w:pPr>
+              <w:pStyle w:val="Compact"/>
+              <w:jc w:val="left"/>
+            </w:pPr>
+            <w:r>
+              <w:t xml:space="preserve">Líquidos</w:t>
+            </w:r>
+          </w:p>
+        </w:tc>
+      </w:tr>
+      <w:tr>
+        <w:tc>
+          <w:tcPr/>
+          <w:p>
+            <w:pPr>
+              <w:pStyle w:val="Compact"/>
+              <w:jc w:val="left"/>
+            </w:pPr>
+            <w:r>
+              <w:t xml:space="preserve">14</w:t>
+            </w:r>
+          </w:p>
+        </w:tc>
+        <w:tc>
+          <w:tcPr/>
+          <w:p>
+            <w:pPr>
+              <w:pStyle w:val="Compact"/>
+              <w:jc w:val="left"/>
+            </w:pPr>
+            <w:r>
+              <w:t xml:space="preserve">https://gncv.sicom.gov.co/login</w:t>
+            </w:r>
+          </w:p>
+        </w:tc>
+        <w:tc>
+          <w:tcPr/>
+          <w:p>
+            <w:pPr>
+              <w:pStyle w:val="Compact"/>
+              <w:jc w:val="left"/>
+            </w:pPr>
+            <w:r>
+              <w:t xml:space="preserve">GNCV</w:t>
+            </w:r>
+          </w:p>
+        </w:tc>
+      </w:tr>
+      <w:tr>
+        <w:tc>
+          <w:tcPr/>
+          <w:p>
+            <w:pPr>
+              <w:pStyle w:val="Compact"/>
+              <w:jc w:val="left"/>
+            </w:pPr>
+            <w:r>
+              <w:t xml:space="preserve">15</w:t>
+            </w:r>
+          </w:p>
+        </w:tc>
+        <w:tc>
+          <w:tcPr/>
+          <w:p>
+            <w:pPr>
+              <w:pStyle w:val="Compact"/>
+              <w:jc w:val="left"/>
+            </w:pPr>
+            <w:r>
+              <w:t xml:space="preserve">https://bwss.sicom.gov.co/sicomdata/</w:t>
+            </w:r>
+          </w:p>
+        </w:tc>
+        <w:tc>
+          <w:tcPr/>
+          <w:p>
+            <w:pPr>
+              <w:pStyle w:val="Compact"/>
+              <w:jc w:val="left"/>
+            </w:pPr>
+            <w:r>
+              <w:t xml:space="preserve">Web Service Backup</w:t>
+            </w:r>
+          </w:p>
+        </w:tc>
+      </w:tr>
+      <w:tr>
+        <w:tc>
+          <w:tcPr/>
+          <w:p>
+            <w:pPr>
+              <w:pStyle w:val="Compact"/>
+              <w:jc w:val="left"/>
+            </w:pPr>
+            <w:r>
+              <w:t xml:space="preserve">16</w:t>
+            </w:r>
+          </w:p>
+        </w:tc>
+        <w:tc>
+          <w:tcPr/>
+          <w:p>
+            <w:pPr>
+              <w:pStyle w:val="Compact"/>
+              <w:jc w:val="left"/>
+            </w:pPr>
+            <w:r>
+              <w:t xml:space="preserve">https://aprendesicom.sicom.gov.co/login/index.php</w:t>
+            </w:r>
+          </w:p>
+        </w:tc>
+        <w:tc>
+          <w:tcPr/>
+          <w:p>
+            <w:pPr>
+              <w:pStyle w:val="Compact"/>
+              <w:jc w:val="left"/>
+            </w:pPr>
+            <w:r>
+              <w:t xml:space="preserve">Capacitaciones</w:t>
+            </w:r>
+          </w:p>
+        </w:tc>
+      </w:tr>
+      <w:tr>
+        <w:tc>
+          <w:tcPr/>
+          <w:p>
+            <w:pPr>
+              <w:pStyle w:val="Compact"/>
+              <w:jc w:val="left"/>
+            </w:pPr>
+            <w:r>
+              <w:t xml:space="preserve">17</w:t>
+            </w:r>
+          </w:p>
+        </w:tc>
+        <w:tc>
+          <w:tcPr/>
+          <w:p>
+            <w:pPr>
+              <w:pStyle w:val="Compact"/>
+              <w:jc w:val="left"/>
+            </w:pPr>
+            <w:r>
+              <w:t xml:space="preserve">https://git.sicom.gov.co/users/sign_in</w:t>
+            </w:r>
+          </w:p>
+        </w:tc>
+        <w:tc>
+          <w:tcPr/>
+          <w:p>
+            <w:pPr>
+              <w:pStyle w:val="Compact"/>
+              <w:jc w:val="left"/>
+            </w:pPr>
+            <w:r>
+              <w:t xml:space="preserve">GitLab</w:t>
+            </w:r>
+          </w:p>
+        </w:tc>
+      </w:tr>
+      <w:tr>
+        <w:tc>
+          <w:tcPr/>
+          <w:p>
+            <w:pPr>
+              <w:pStyle w:val="Compact"/>
+              <w:jc w:val="left"/>
+            </w:pPr>
+            <w:r>
+              <w:t xml:space="preserve">18</w:t>
+            </w:r>
+          </w:p>
+        </w:tc>
+        <w:tc>
+          <w:tcPr/>
+          <w:p>
+            <w:pPr>
+              <w:pStyle w:val="Compact"/>
+              <w:jc w:val="left"/>
+            </w:pPr>
+            <w:r>
+              <w:t xml:space="preserve">https://sigdi.sicom.gov.co/guias/</w:t>
+            </w:r>
+          </w:p>
+        </w:tc>
+        <w:tc>
+          <w:tcPr/>
+          <w:p>
+            <w:pPr>
+              <w:pStyle w:val="Compact"/>
+              <w:jc w:val="left"/>
+            </w:pPr>
+            <w:r>
+              <w:t xml:space="preserve">SIGDI</w:t>
+            </w:r>
+          </w:p>
+        </w:tc>
+      </w:tr>
+      <w:tr>
+        <w:tc>
+          <w:tcPr/>
+          <w:p>
+            <w:pPr>
+              <w:pStyle w:val="Compact"/>
+              <w:jc w:val="left"/>
+            </w:pPr>
+            <w:r>
+              <w:t xml:space="preserve">19</w:t>
+            </w:r>
+          </w:p>
+        </w:tc>
+        <w:tc>
+          <w:tcPr/>
+          <w:p>
+            <w:pPr>
+              <w:pStyle w:val="Compact"/>
+              <w:jc w:val="left"/>
+            </w:pPr>
+            <w:r>
+              <w:t xml:space="preserve">https://pru.api.sicom.gov.co</w:t>
+            </w:r>
+          </w:p>
+        </w:tc>
+        <w:tc>
+          <w:tcPr/>
+          <w:p>
+            <w:pPr>
+              <w:pStyle w:val="Compact"/>
+              <w:jc w:val="left"/>
+            </w:pPr>
+            <w:r>
+              <w:t xml:space="preserve">API Pruebas</w:t>
+            </w:r>
+          </w:p>
+        </w:tc>
+      </w:tr>
+      <w:tr>
+        <w:tc>
+          <w:tcPr/>
+          <w:p>
+            <w:pPr>
+              <w:pStyle w:val="Compact"/>
+              <w:jc w:val="left"/>
+            </w:pPr>
+            <w:r>
+              <w:t xml:space="preserve">20</w:t>
+            </w:r>
+          </w:p>
+        </w:tc>
+        <w:tc>
+          <w:tcPr/>
+          <w:p>
+            <w:pPr>
+              <w:pStyle w:val="Compact"/>
+              <w:jc w:val="left"/>
+            </w:pPr>
+            <w:r>
+              <w:t xml:space="preserve">https://api.sicom.gov.co</w:t>
+            </w:r>
+          </w:p>
+        </w:tc>
+        <w:tc>
+          <w:tcPr/>
+          <w:p>
+            <w:pPr>
+              <w:pStyle w:val="Compact"/>
+              <w:jc w:val="left"/>
+            </w:pPr>
+            <w:r>
+              <w:t xml:space="preserve">API Producción</w:t>
+            </w:r>
+          </w:p>
+        </w:tc>
+      </w:tr>
+      <w:tr>
+        <w:tc>
+          <w:tcPr/>
+          <w:p>
+            <w:pPr>
+              <w:pStyle w:val="Compact"/>
+              <w:jc w:val="left"/>
+            </w:pPr>
+            <w:r>
+              <w:t xml:space="preserve">21</w:t>
+            </w:r>
+          </w:p>
+        </w:tc>
+        <w:tc>
+          <w:tcPr/>
+          <w:p>
+            <w:pPr>
+              <w:pStyle w:val="Compact"/>
+              <w:jc w:val="left"/>
+            </w:pPr>
+            <w:r>
+              <w:t xml:space="preserve">https://cubos.sicom.gov.co</w:t>
+            </w:r>
+          </w:p>
+        </w:tc>
+        <w:tc>
+          <w:tcPr/>
+          <w:p>
+            <w:pPr>
+              <w:pStyle w:val="Compact"/>
+              <w:jc w:val="left"/>
+            </w:pPr>
+            <w:r>
+              <w:t xml:space="preserve">Cubos BI</w:t>
+            </w:r>
+          </w:p>
+        </w:tc>
+      </w:tr>
+      <w:tr>
+        <w:tc>
+          <w:tcPr/>
+          <w:p>
+            <w:pPr>
+              <w:pStyle w:val="Compact"/>
+              <w:jc w:val="left"/>
+            </w:pPr>
+            <w:r>
+              <w:t xml:space="preserve">22</w:t>
+            </w:r>
+          </w:p>
+        </w:tc>
+        <w:tc>
+          <w:tcPr/>
+          <w:p>
+            <w:pPr>
+              <w:pStyle w:val="Compact"/>
+              <w:jc w:val="left"/>
+            </w:pPr>
+            <w:r>
+              <w:t xml:space="preserve">https://moduloconsultas.sicom.gov.co/Login</w:t>
+            </w:r>
+          </w:p>
+        </w:tc>
+        <w:tc>
+          <w:tcPr/>
+          <w:p>
+            <w:pPr>
+              <w:pStyle w:val="Compact"/>
+              <w:jc w:val="left"/>
+            </w:pPr>
+            <w:r>
+              <w:t xml:space="preserve">Consultas</w:t>
+            </w:r>
+          </w:p>
+        </w:tc>
+      </w:tr>
+      <w:tr>
+        <w:tc>
+          <w:tcPr/>
+          <w:p>
+            <w:pPr>
+              <w:pStyle w:val="Compact"/>
+              <w:jc w:val="left"/>
+            </w:pPr>
+            <w:r>
+              <w:t xml:space="preserve">23</w:t>
+            </w:r>
+          </w:p>
+        </w:tc>
+        <w:tc>
+          <w:tcPr/>
+          <w:p>
+            <w:pPr>
+              <w:pStyle w:val="Compact"/>
+              <w:jc w:val="left"/>
+            </w:pPr>
+            <w:r>
+              <w:t xml:space="preserve">https://sigdipruebas.sicom.gov.co/</w:t>
+            </w:r>
+          </w:p>
+        </w:tc>
+        <w:tc>
+          <w:tcPr/>
+          <w:p>
+            <w:pPr>
+              <w:pStyle w:val="Compact"/>
+              <w:jc w:val="left"/>
+            </w:pPr>
+            <w:r>
+              <w:t xml:space="preserve">SIGDI Pruebas</w:t>
+            </w:r>
+          </w:p>
+        </w:tc>
+      </w:tr>
+      <w:tr>
+        <w:tc>
+          <w:tcPr/>
+          <w:p>
+            <w:pPr>
+              <w:pStyle w:val="Compact"/>
+              <w:jc w:val="left"/>
+            </w:pPr>
+            <w:r>
+              <w:t xml:space="preserve">24</w:t>
+            </w:r>
+          </w:p>
+        </w:tc>
+        <w:tc>
+          <w:tcPr/>
+          <w:p>
+            <w:pPr>
+              <w:pStyle w:val="Compact"/>
+              <w:jc w:val="left"/>
+            </w:pPr>
+            <w:r>
+              <w:t xml:space="preserve">https://uatsicomconsultas.sicom.gov.co/</w:t>
+            </w:r>
+          </w:p>
+        </w:tc>
+        <w:tc>
+          <w:tcPr/>
+          <w:p>
+            <w:pPr>
+              <w:pStyle w:val="Compact"/>
+              <w:jc w:val="left"/>
+            </w:pPr>
+            <w:r>
+              <w:t xml:space="preserve">UAT Consultas</w:t>
+            </w:r>
+          </w:p>
+        </w:tc>
+      </w:tr>
+      <w:tr>
+        <w:tc>
+          <w:tcPr/>
+          <w:p>
+            <w:pPr>
+              <w:pStyle w:val="Compact"/>
+              <w:jc w:val="left"/>
+            </w:pPr>
+            <w:r>
+              <w:t xml:space="preserve">25</w:t>
+            </w:r>
+          </w:p>
+        </w:tc>
+        <w:tc>
+          <w:tcPr/>
+          <w:p>
+            <w:pPr>
+              <w:pStyle w:val="Compact"/>
+              <w:jc w:val="left"/>
+            </w:pPr>
+            <w:r>
+              <w:t xml:space="preserve">https://wsp.sicom.gov.co/</w:t>
+            </w:r>
+          </w:p>
+        </w:tc>
+        <w:tc>
+          <w:tcPr/>
+          <w:p>
+            <w:pPr>
+              <w:pStyle w:val="Compact"/>
+              <w:jc w:val="left"/>
+            </w:pPr>
+            <w:r>
+              <w:t xml:space="preserve">Web Service Public</w:t>
+            </w:r>
+          </w:p>
+        </w:tc>
+      </w:tr>
+      <w:tr>
+        <w:tc>
+          <w:tcPr/>
+          <w:p>
+            <w:pPr>
+              <w:pStyle w:val="Compact"/>
+              <w:jc w:val="left"/>
+            </w:pPr>
+            <w:r>
+              <w:t xml:space="preserve">26</w:t>
+            </w:r>
+          </w:p>
+        </w:tc>
+        <w:tc>
+          <w:tcPr/>
+          <w:p>
+            <w:pPr>
+              <w:pStyle w:val="Compact"/>
+              <w:jc w:val="left"/>
+            </w:pPr>
+            <w:r>
+              <w:t xml:space="preserve">https://uatbpm.sicom.gov.co/UAT_TEST/</w:t>
+            </w:r>
+          </w:p>
+        </w:tc>
+        <w:tc>
+          <w:tcPr/>
+          <w:p>
+            <w:pPr>
+              <w:pStyle w:val="Compact"/>
+              <w:jc w:val="left"/>
+            </w:pPr>
+            <w:r>
+              <w:t xml:space="preserve">UAT BPM</w:t>
+            </w:r>
+          </w:p>
+        </w:tc>
+      </w:tr>
+      <w:tr>
+        <w:tc>
+          <w:tcPr/>
+          <w:p>
+            <w:pPr>
+              <w:pStyle w:val="Compact"/>
+              <w:jc w:val="left"/>
+            </w:pPr>
+            <w:r>
+              <w:t xml:space="preserve">27</w:t>
+            </w:r>
+          </w:p>
+        </w:tc>
+        <w:tc>
+          <w:tcPr/>
+          <w:p>
+            <w:pPr>
+              <w:pStyle w:val="Compact"/>
+              <w:jc w:val="left"/>
+            </w:pPr>
+            <w:r>
+              <w:t xml:space="preserve">https://uatbpm.sicom.gov.co/ws/sicomdata</w:t>
+            </w:r>
+          </w:p>
+        </w:tc>
+        <w:tc>
+          <w:tcPr/>
+          <w:p>
+            <w:pPr>
+              <w:pStyle w:val="Compact"/>
+              <w:jc w:val="left"/>
+            </w:pPr>
+            <w:r>
+              <w:t xml:space="preserve">UAT BPM WS</w:t>
+            </w:r>
+          </w:p>
+        </w:tc>
+      </w:tr>
+    </w:tbl>
+    <w:p>
+      <w:r>
+        <w:pict>
+          <v:rect style="width:0;height:1.5pt" o:hralign="center" o:hrstd="t" o:hr="t"/>
+        </w:pict>
+      </w:r>
+    </w:p>
+    <w:bookmarkEnd w:id="98"/>
+    <w:bookmarkEnd w:id="99"/>
+    <w:bookmarkStart w:id="100" w:name="Xcf480b246746a0d07a46dfbaf081842c57a4f5d"/>
+    <w:p>
+      <w:pPr>
+        <w:pStyle w:val="Heading2"/>
+      </w:pPr>
+      <w:r>
+        <w:t xml:space="preserve">ANEXO D: PROCEDIMIENTO DE GESTIÓN DE VULNERABILIDADES</w:t>
+      </w:r>
+    </w:p>
+    <w:p>
+      <w:pPr>
+        <w:pStyle w:val="FirstParagraph"/>
+      </w:pPr>
+      <w:r>
+        <w:rPr>
+          <w:bCs/>
+          <w:b/>
+        </w:rPr>
+        <w:t xml:space="preserve">Responsable:</w:t>
+      </w:r>
+      <w:r>
+        <w:t xml:space="preserve"> </w:t>
+      </w:r>
+      <w:r>
+        <w:t xml:space="preserve">INTERNEXA S.A.</w:t>
+      </w:r>
+    </w:p>
+    <w:tbl>
+      <w:tblPr>
+        <w:tblStyle w:val="Table"/>
+        <w:tblW w:type="pct" w:w="5000"/>
+        <w:tblLook w:firstRow="1" w:lastRow="0" w:firstColumn="0" w:lastColumn="0" w:noHBand="0" w:noVBand="0" w:val="0020"/>
+        <w:jc w:val="start"/>
+      </w:tblPr>
+      <w:tblGrid>
+        <w:gridCol w:w="1584"/>
+        <w:gridCol w:w="2904"/>
+        <w:gridCol w:w="3432"/>
+      </w:tblGrid>
+      <w:tr>
+        <w:trPr>
+          <w:tblHeader w:val="true"/>
+        </w:trPr>
+        <w:tc>
+          <w:tcPr/>
+          <w:p>
+            <w:pPr>
+              <w:pStyle w:val="Compact"/>
+              <w:jc w:val="left"/>
+            </w:pPr>
+            <w:r>
+              <w:t xml:space="preserve">Paso</w:t>
+            </w:r>
+          </w:p>
+        </w:tc>
+        <w:tc>
+          <w:tcPr/>
+          <w:p>
+            <w:pPr>
+              <w:pStyle w:val="Compact"/>
+              <w:jc w:val="left"/>
+            </w:pPr>
+            <w:r>
+              <w:t xml:space="preserve">Actividad</w:t>
+            </w:r>
+          </w:p>
+        </w:tc>
+        <w:tc>
+          <w:tcPr/>
+          <w:p>
+            <w:pPr>
+              <w:pStyle w:val="Compact"/>
+              <w:jc w:val="left"/>
+            </w:pPr>
+            <w:r>
+              <w:t xml:space="preserve">Descripción</w:t>
+            </w:r>
+          </w:p>
+        </w:tc>
+      </w:tr>
+      <w:tr>
+        <w:tc>
+          <w:tcPr/>
+          <w:p>
+            <w:pPr>
+              <w:pStyle w:val="Compact"/>
+              <w:jc w:val="left"/>
+            </w:pPr>
+            <w:r>
+              <w:t xml:space="preserve">1</w:t>
+            </w:r>
+          </w:p>
+        </w:tc>
+        <w:tc>
+          <w:tcPr/>
+          <w:p>
+            <w:pPr>
+              <w:pStyle w:val="Compact"/>
+              <w:jc w:val="left"/>
+            </w:pPr>
+            <w:r>
+              <w:t xml:space="preserve">Escaneo</w:t>
+            </w:r>
+          </w:p>
+        </w:tc>
+        <w:tc>
+          <w:tcPr/>
+          <w:p>
+            <w:pPr>
+              <w:pStyle w:val="Compact"/>
+              <w:jc w:val="left"/>
+            </w:pPr>
+            <w:r>
+              <w:t xml:space="preserve">Realizar escaneo a todos los dispositivos en la línea base mediante herramienta de análisis de vulnerabilidades según política establecida</w:t>
+            </w:r>
+          </w:p>
+        </w:tc>
+      </w:tr>
+      <w:tr>
+        <w:tc>
+          <w:tcPr/>
+          <w:p>
+            <w:pPr>
+              <w:pStyle w:val="Compact"/>
+              <w:jc w:val="left"/>
+            </w:pPr>
+            <w:r>
+              <w:t xml:space="preserve">2</w:t>
+            </w:r>
+          </w:p>
+        </w:tc>
+        <w:tc>
+          <w:tcPr/>
+          <w:p>
+            <w:pPr>
+              <w:pStyle w:val="Compact"/>
+              <w:jc w:val="left"/>
+            </w:pPr>
+            <w:r>
+              <w:t xml:space="preserve">Evaluación</w:t>
+            </w:r>
+          </w:p>
+        </w:tc>
+        <w:tc>
+          <w:tcPr/>
+          <w:p>
+            <w:pPr>
+              <w:pStyle w:val="Compact"/>
+              <w:jc w:val="left"/>
+            </w:pPr>
+            <w:r>
+              <w:t xml:space="preserve">Evaluar y analizar resultados obtenidos y clasificar según criticidad</w:t>
+            </w:r>
+          </w:p>
+        </w:tc>
+      </w:tr>
+      <w:tr>
+        <w:tc>
+          <w:tcPr/>
+          <w:p>
+            <w:pPr>
+              <w:pStyle w:val="Compact"/>
+              <w:jc w:val="left"/>
+            </w:pPr>
+            <w:r>
+              <w:t xml:space="preserve">3</w:t>
+            </w:r>
+          </w:p>
+        </w:tc>
+        <w:tc>
+          <w:tcPr/>
+          <w:p>
+            <w:pPr>
+              <w:pStyle w:val="Compact"/>
+              <w:jc w:val="left"/>
+            </w:pPr>
+            <w:r>
+              <w:t xml:space="preserve">Plan de Remediación</w:t>
+            </w:r>
+          </w:p>
+        </w:tc>
+        <w:tc>
+          <w:tcPr/>
+          <w:p>
+            <w:pPr>
+              <w:pStyle w:val="Compact"/>
+              <w:jc w:val="left"/>
+            </w:pPr>
+            <w:r>
+              <w:t xml:space="preserve">Generar plan de mitigación. En caso necesario escalar al proveedor/fabricante para encontrar solución de cierre</w:t>
+            </w:r>
+          </w:p>
+        </w:tc>
+      </w:tr>
+      <w:tr>
+        <w:tc>
+          <w:tcPr/>
+          <w:p>
+            <w:pPr>
+              <w:pStyle w:val="Compact"/>
+              <w:jc w:val="left"/>
+            </w:pPr>
+            <w:r>
+              <w:t xml:space="preserve">4</w:t>
+            </w:r>
+          </w:p>
+        </w:tc>
+        <w:tc>
+          <w:tcPr/>
+          <w:p>
+            <w:pPr>
+              <w:pStyle w:val="Compact"/>
+              <w:jc w:val="left"/>
+            </w:pPr>
+            <w:r>
+              <w:t xml:space="preserve">Retest</w:t>
+            </w:r>
+          </w:p>
+        </w:tc>
+        <w:tc>
+          <w:tcPr/>
+          <w:p>
+            <w:pPr>
+              <w:pStyle w:val="Compact"/>
+              <w:jc w:val="left"/>
+            </w:pPr>
+            <w:r>
+              <w:t xml:space="preserve">Realizar segundo escaneo para verificar cierre</w:t>
+            </w:r>
+          </w:p>
+        </w:tc>
+      </w:tr>
+      <w:tr>
+        <w:tc>
+          <w:tcPr/>
+          <w:p>
+            <w:pPr>
+              <w:pStyle w:val="Compact"/>
+              <w:jc w:val="left"/>
+            </w:pPr>
+            <w:r>
+              <w:t xml:space="preserve">5</w:t>
+            </w:r>
+          </w:p>
+        </w:tc>
+        <w:tc>
+          <w:tcPr/>
+          <w:p>
+            <w:pPr>
+              <w:pStyle w:val="Compact"/>
+              <w:jc w:val="left"/>
+            </w:pPr>
+            <w:r>
+              <w:t xml:space="preserve">Verificación</w:t>
+            </w:r>
+          </w:p>
+        </w:tc>
+        <w:tc>
+          <w:tcPr/>
+          <w:p>
+            <w:pPr>
+              <w:pStyle w:val="Compact"/>
+              <w:jc w:val="left"/>
+            </w:pPr>
+            <w:r>
+              <w:t xml:space="preserve">Verificar resultados del Retest. Si no se cerraron, analizar si se requiere nuevo plan de mitigación</w:t>
+            </w:r>
+          </w:p>
+        </w:tc>
+      </w:tr>
+      <w:tr>
+        <w:tc>
+          <w:tcPr/>
+          <w:p>
+            <w:pPr>
+              <w:pStyle w:val="Compact"/>
+              <w:jc w:val="left"/>
+            </w:pPr>
+            <w:r>
+              <w:t xml:space="preserve">6</w:t>
+            </w:r>
+          </w:p>
+        </w:tc>
+        <w:tc>
+          <w:tcPr/>
+          <w:p>
+            <w:pPr>
+              <w:pStyle w:val="Compact"/>
+              <w:jc w:val="left"/>
+            </w:pPr>
+            <w:r>
+              <w:t xml:space="preserve">Informe Técnico</w:t>
+            </w:r>
+          </w:p>
+        </w:tc>
+        <w:tc>
+          <w:tcPr/>
+          <w:p>
+            <w:pPr>
+              <w:pStyle w:val="Compact"/>
+              <w:jc w:val="left"/>
+            </w:pPr>
+            <w:r>
+              <w:t xml:space="preserve">Generar informe técnico con detalles del análisis</w:t>
+            </w:r>
+          </w:p>
+        </w:tc>
+      </w:tr>
+      <w:tr>
+        <w:tc>
+          <w:tcPr/>
+          <w:p>
+            <w:pPr>
+              <w:pStyle w:val="Compact"/>
+              <w:jc w:val="left"/>
+            </w:pPr>
+            <w:r>
+              <w:t xml:space="preserve">7</w:t>
+            </w:r>
+          </w:p>
+        </w:tc>
+        <w:tc>
+          <w:tcPr/>
+          <w:p>
+            <w:pPr>
+              <w:pStyle w:val="Compact"/>
+              <w:jc w:val="left"/>
+            </w:pPr>
+            <w:r>
+              <w:t xml:space="preserve">Análisis de Riesgo</w:t>
+            </w:r>
+          </w:p>
+        </w:tc>
+        <w:tc>
+          <w:tcPr/>
+          <w:p>
+            <w:pPr>
+              <w:pStyle w:val="Compact"/>
+              <w:jc w:val="left"/>
+            </w:pPr>
+            <w:r>
+              <w:t xml:space="preserve">Efectuar análisis de riesgo para estimar probabilidad de materialización de evento no deseado</w:t>
+            </w:r>
+          </w:p>
+        </w:tc>
+      </w:tr>
+      <w:tr>
+        <w:tc>
+          <w:tcPr/>
+          <w:p>
+            <w:pPr>
+              <w:pStyle w:val="Compact"/>
+              <w:jc w:val="left"/>
+            </w:pPr>
+            <w:r>
+              <w:t xml:space="preserve">8</w:t>
+            </w:r>
+          </w:p>
+        </w:tc>
+        <w:tc>
+          <w:tcPr/>
+          <w:p>
+            <w:pPr>
+              <w:pStyle w:val="Compact"/>
+              <w:jc w:val="left"/>
+            </w:pPr>
+            <w:r>
+              <w:t xml:space="preserve">Informe Ejecutivo</w:t>
+            </w:r>
+          </w:p>
+        </w:tc>
+        <w:tc>
+          <w:tcPr/>
+          <w:p>
+            <w:pPr>
+              <w:pStyle w:val="Compact"/>
+              <w:jc w:val="left"/>
+            </w:pPr>
+            <w:r>
+              <w:t xml:space="preserve">Generar y presentar informe ejecutivo en formato Word</w:t>
+            </w:r>
+          </w:p>
+        </w:tc>
+      </w:tr>
+    </w:tbl>
+    <w:p>
+      <w:r>
+        <w:pict>
+          <v:rect style="width:0;height:1.5pt" o:hralign="center" o:hrstd="t" o:hr="t"/>
+        </w:pict>
+      </w:r>
+    </w:p>
+    <w:bookmarkEnd w:id="100"/>
+    <w:bookmarkStart w:id="101" w:name="X08cef422018fd662276398ac77ee39946383a47"/>
+    <w:p>
+      <w:pPr>
+        <w:pStyle w:val="Heading2"/>
+      </w:pPr>
+      <w:r>
+        <w:t xml:space="preserve">ANEXO E: MÓDULO DE CONTINGENCIAS DE ABASTECIMIENTO</w:t>
+      </w:r>
+    </w:p>
+    <w:p>
+      <w:pPr>
+        <w:pStyle w:val="FirstParagraph"/>
+      </w:pPr>
+      <w:r>
+        <w:rPr>
+          <w:bCs/>
+          <w:b/>
+        </w:rPr>
+        <w:t xml:space="preserve">Historia de Usuario:</w:t>
+      </w:r>
+      <w:r>
+        <w:t xml:space="preserve"> </w:t>
+      </w:r>
+      <w:r>
+        <w:t xml:space="preserve">HU-1531 — Configuración de Plantas Para Contingencias</w:t>
+      </w:r>
+    </w:p>
+    <w:p>
+      <w:pPr>
+        <w:pStyle w:val="BodyText"/>
+      </w:pPr>
+      <w:r>
+        <w:rPr>
+          <w:bCs/>
+          <w:b/>
+        </w:rPr>
+        <w:t xml:space="preserve">Objetivo:</w:t>
+      </w:r>
+      <w:r>
+        <w:t xml:space="preserve"> </w:t>
+      </w:r>
+      <w:r>
+        <w:t xml:space="preserve">Crear un módulo que permita realizar cambios temporales en los planes de abastecimiento habituales de una región o regiones específicas del país, garantizando que no se interrumpa el abastecimiento de combustible ante eventualidades.</w:t>
+      </w:r>
+    </w:p>
+    <w:p>
+      <w:pPr>
+        <w:pStyle w:val="BodyText"/>
+      </w:pPr>
+      <w:r>
+        <w:rPr>
+          <w:bCs/>
+          <w:b/>
+        </w:rPr>
+        <w:t xml:space="preserve">Reglas de Negocio:</w:t>
+      </w:r>
+      <w:r>
+        <w:t xml:space="preserve"> </w:t>
+      </w:r>
+      <w:r>
+        <w:t xml:space="preserve">- Se instancia un caso para cada mayorista que opere en la zona de contingencia</w:t>
+      </w:r>
+      <w:r>
+        <w:t xml:space="preserve"> </w:t>
+      </w:r>
+      <w:r>
+        <w:t xml:space="preserve">- El módulo cuenta con filtros: Departamento, Municipio, Mayorista, Plantas asociadas</w:t>
+      </w:r>
+      <w:r>
+        <w:t xml:space="preserve"> </w:t>
+      </w:r>
+      <w:r>
+        <w:t xml:space="preserve">- Los mayoristas mostrados son aquellos con contrato de suministro con EDS activas (Automotrices y Fluviales) del Departamento/Municipio seleccionado</w:t>
+      </w:r>
+      <w:r>
+        <w:t xml:space="preserve"> </w:t>
+      </w:r>
+      <w:r>
+        <w:t xml:space="preserve">- Se presenta una colección de plantas asociadas al mayorista para desactivar la actual y activar la de contingencia</w:t>
+      </w:r>
+      <w:r>
+        <w:t xml:space="preserve"> </w:t>
+      </w:r>
+      <w:r>
+        <w:t xml:space="preserve">-</w:t>
+      </w:r>
+      <w:r>
+        <w:t xml:space="preserve"> </w:t>
+      </w:r>
+      <w:r>
+        <w:rPr>
+          <w:bCs/>
+          <w:b/>
+        </w:rPr>
+        <w:t xml:space="preserve">Excepciones por ubicación:</w:t>
+      </w:r>
+      <w:r>
+        <w:t xml:space="preserve"> </w:t>
+      </w:r>
+      <w:r>
+        <w:t xml:space="preserve">En municipios donde EDS del casco urbano tienen plan diferente a las de zona rural, se maneja un check de excepción que abre colección de EDS del municipio y plantas asociadas</w:t>
+      </w:r>
+      <w:r>
+        <w:t xml:space="preserve"> </w:t>
+      </w:r>
+      <w:r>
+        <w:t xml:space="preserve">- A las EDS solo se les configura</w:t>
+      </w:r>
+      <w:r>
+        <w:t xml:space="preserve"> </w:t>
+      </w:r>
+      <w:r>
+        <w:rPr>
+          <w:bCs/>
+          <w:b/>
+        </w:rPr>
+        <w:t xml:space="preserve">una planta de contingencia</w:t>
+      </w:r>
+      <w:r>
+        <w:t xml:space="preserve">, única visible al momento de realizar OPS</w:t>
+      </w:r>
+      <w:r>
+        <w:t xml:space="preserve"> </w:t>
+      </w:r>
+      <w:r>
+        <w:t xml:space="preserve">-</w:t>
+      </w:r>
+      <w:r>
+        <w:t xml:space="preserve"> </w:t>
+      </w:r>
+      <w:r>
+        <w:rPr>
+          <w:bCs/>
+          <w:b/>
+        </w:rPr>
+        <w:t xml:space="preserve">Temporizador de contingencia:</w:t>
+      </w:r>
+      <w:r>
+        <w:t xml:space="preserve"> </w:t>
+      </w:r>
+      <w:r>
+        <w:t xml:space="preserve">Fecha de inicio + cantidad de días = fecha fin automática (hasta las 23:59 horas). La fecha fin no es editable</w:t>
+      </w:r>
+      <w:r>
+        <w:t xml:space="preserve"> </w:t>
+      </w:r>
+      <w:r>
+        <w:t xml:space="preserve">- En caso de prórroga: la cantidad total de días debe ser superior a la contingencia inicial (ej: si fueron 10 días, la actualización debe ser 11 o más)</w:t>
+      </w:r>
+      <w:r>
+        <w:t xml:space="preserve"> </w:t>
+      </w:r>
+      <w:r>
+        <w:t xml:space="preserve">- Al terminar la contingencia, se restablece automáticamente la configuración de plantas del plan de abastecimiento definido</w:t>
+      </w:r>
+      <w:r>
+        <w:t xml:space="preserve"> </w:t>
+      </w:r>
+      <w:r>
+        <w:t xml:space="preserve">- Si ingresa una EDS nueva durante el periodo de contingencia, el operador SICOM debe instanciar un caso para activarle la planta de contingencia</w:t>
+      </w:r>
+      <w:r>
+        <w:t xml:space="preserve"> </w:t>
+      </w:r>
+      <w:r>
+        <w:t xml:space="preserve">- La actualización de casos instanciados permite ampliar días de contingencia mostrando el total</w:t>
+      </w:r>
+      <w:r>
+        <w:t xml:space="preserve"> </w:t>
+      </w:r>
+      <w:r>
+        <w:t xml:space="preserve">- Se puede deshabilitar la contingencia antes del tiempo configurado mediante botón de deshabilitar</w:t>
+      </w:r>
+    </w:p>
+    <w:p>
+      <w:pPr>
+        <w:pStyle w:val="BodyText"/>
+      </w:pPr>
+      <w:r>
+        <w:rPr>
+          <w:bCs/>
+          <w:b/>
+        </w:rPr>
+        <w:t xml:space="preserve">Criterios de Aceptación:</w:t>
+      </w:r>
+      <w:r>
+        <w:t xml:space="preserve"> </w:t>
+      </w:r>
+      <w:r>
+        <w:t xml:space="preserve">- El usuario operador de SICOM puede configurar, activar y/o desactivar plantas de manera temporal para activar planes de contingencia de abastecimiento</w:t>
+      </w:r>
+    </w:p>
+    <w:p>
+      <w:r>
+        <w:pict>
+          <v:rect style="width:0;height:1.5pt" o:hralign="center" o:hrstd="t" o:hr="t"/>
+        </w:pict>
+      </w:r>
+    </w:p>
+    <w:bookmarkEnd w:id="101"/>
+    <w:bookmarkStart w:id="102" w:name="Xa0731ae6eb5e24bdb48a941896911526a696433"/>
+    <w:p>
+      <w:pPr>
+        <w:pStyle w:val="Heading2"/>
+      </w:pPr>
+      <w:r>
+        <w:t xml:space="preserve">ANEXO F: DATASET DE CASOS ARANDA — ENERO 2026</w:t>
+      </w:r>
+    </w:p>
+    <w:p>
+      <w:pPr>
+        <w:pStyle w:val="FirstParagraph"/>
+      </w:pPr>
+      <w:r>
+        <w:rPr>
+          <w:bCs/>
+          <w:b/>
+        </w:rPr>
+        <w:t xml:space="preserve">Total de casos analizados:</w:t>
+      </w:r>
+      <w:r>
+        <w:t xml:space="preserve"> </w:t>
+      </w:r>
+      <w:r>
+        <w:t xml:space="preserve">~1,900 registros</w:t>
+      </w:r>
+    </w:p>
+    <w:p>
+      <w:pPr>
+        <w:pStyle w:val="BodyText"/>
+      </w:pPr>
+      <w:r>
+        <w:rPr>
+          <w:bCs/>
+          <w:b/>
+        </w:rPr>
+        <w:t xml:space="preserve">Categorías principales de incidentes:</w:t>
+      </w:r>
+      <w:r>
+        <w:t xml:space="preserve"> </w:t>
+      </w:r>
+      <w:r>
+        <w:t xml:space="preserve">- FALLA INGRESO A SIGDI</w:t>
+      </w:r>
+      <w:r>
+        <w:t xml:space="preserve"> </w:t>
+      </w:r>
+      <w:r>
+        <w:t xml:space="preserve">- FALLA INGRESO A SICOM LÍQUIDOS</w:t>
+      </w:r>
+      <w:r>
+        <w:t xml:space="preserve"> </w:t>
+      </w:r>
+      <w:r>
+        <w:t xml:space="preserve">- FALLA TRANSMISIÓN DATOS WEB SERVICE SICOM LÍQUIDOS</w:t>
+      </w:r>
+      <w:r>
+        <w:t xml:space="preserve"> </w:t>
+      </w:r>
+      <w:r>
+        <w:t xml:space="preserve">- FALLA INGRESO A SICOM GNCV</w:t>
+      </w:r>
+      <w:r>
+        <w:t xml:space="preserve"> </w:t>
+      </w:r>
+      <w:r>
+        <w:t xml:space="preserve">- FALLA TRANSMISIÓN DATOS WEB SERVICE SICOM GNCV</w:t>
+      </w:r>
+    </w:p>
+    <w:p>
+      <w:pPr>
+        <w:pStyle w:val="BodyText"/>
+      </w:pPr>
+      <w:r>
+        <w:rPr>
+          <w:bCs/>
+          <w:b/>
+        </w:rPr>
+        <w:t xml:space="preserve">Estados de casos:</w:t>
+      </w:r>
+      <w:r>
+        <w:t xml:space="preserve"> </w:t>
+      </w:r>
+      <w:r>
+        <w:t xml:space="preserve">- CANCELADO (Mayoría — casos mal registrados que se derivan a portal de Autogestión)</w:t>
+      </w:r>
+      <w:r>
+        <w:t xml:space="preserve"> </w:t>
+      </w:r>
+      <w:r>
+        <w:t xml:space="preserve">- CERRADO (Casos resueltos por Grupo de Análisis SICOM)</w:t>
+      </w:r>
+    </w:p>
+    <w:p>
+      <w:pPr>
+        <w:pStyle w:val="BodyText"/>
+      </w:pPr>
+      <w:r>
+        <w:rPr>
+          <w:bCs/>
+          <w:b/>
+        </w:rPr>
+        <w:t xml:space="preserve">SLA aplicado:</w:t>
+      </w:r>
+      <w:r>
+        <w:t xml:space="preserve"> </w:t>
+      </w:r>
+      <w:r>
+        <w:t xml:space="preserve">MEDIO 24H (Tiempo máximo de atención: 24 horas)</w:t>
+      </w:r>
+    </w:p>
+    <w:p>
+      <w:pPr>
+        <w:pStyle w:val="BodyText"/>
+      </w:pPr>
+      <w:r>
+        <w:rPr>
+          <w:bCs/>
+          <w:b/>
+        </w:rPr>
+        <w:t xml:space="preserve">Canales de registro:</w:t>
+      </w:r>
+      <w:r>
+        <w:t xml:space="preserve"> </w:t>
+      </w:r>
+      <w:r>
+        <w:t xml:space="preserve">Portal Cliente (principal), Call Center</w:t>
+      </w:r>
+    </w:p>
+    <w:p>
+      <w:pPr>
+        <w:pStyle w:val="BodyText"/>
+      </w:pPr>
+      <w:r>
+        <w:rPr>
+          <w:bCs/>
+          <w:b/>
+        </w:rPr>
+        <w:t xml:space="preserve">Grupos de resolución:</w:t>
+      </w:r>
+      <w:r>
+        <w:t xml:space="preserve"> </w:t>
+      </w:r>
+      <w:r>
+        <w:t xml:space="preserve">- CALL CENTER (N1)</w:t>
+      </w:r>
+      <w:r>
+        <w:t xml:space="preserve"> </w:t>
+      </w:r>
+      <w:r>
+        <w:t xml:space="preserve">- INTERNEXA FUNCIONAL (N2)</w:t>
+      </w:r>
+    </w:p>
+    <w:p>
+      <w:pPr>
+        <w:pStyle w:val="BodyText"/>
+      </w:pPr>
+      <w:r>
+        <w:rPr>
+          <w:bCs/>
+          <w:b/>
+        </w:rPr>
+        <w:t xml:space="preserve">Ejemplo de caso típico:</w:t>
+      </w:r>
+      <w:r>
+        <w:t xml:space="preserve"> </w:t>
+      </w:r>
+      <w:r>
+        <w:t xml:space="preserve">- Caso 3562: FALLA INGRESO A SIGDI — No llegaban códigos de verificación a correos</w:t>
+      </w:r>
+      <w:r>
+        <w:t xml:space="preserve"> </w:t>
+      </w:r>
+      <w:r>
+        <w:t xml:space="preserve">- Fecha registro: 2026-01-22</w:t>
+      </w:r>
+      <w:r>
+        <w:t xml:space="preserve"> </w:t>
+      </w:r>
+      <w:r>
+        <w:t xml:space="preserve">- Fecha cierre: 2026-01-28 (6 días)</w:t>
+      </w:r>
+      <w:r>
+        <w:t xml:space="preserve"> </w:t>
+      </w:r>
+      <w:r>
+        <w:t xml:space="preserve">- Grupo resolutor: INTERNEXA FUNCIONAL</w:t>
+      </w:r>
+      <w:r>
+        <w:t xml:space="preserve"> </w:t>
+      </w:r>
+      <w:r>
+        <w:t xml:space="preserve">- Solución: Ajuste en el sistema para estabilizar operación y acceso en la plataforma</w:t>
+      </w:r>
+    </w:p>
+    <w:p>
+      <w:r>
+        <w:pict>
+          <v:rect style="width:0;height:1.5pt" o:hralign="center" o:hrstd="t" o:hr="t"/>
+        </w:pict>
+      </w:r>
+    </w:p>
+    <w:bookmarkEnd w:id="102"/>
+    <w:bookmarkStart w:id="103" w:name="X596d5588153d26290bf4c1bccc0cf058f70269f"/>
+    <w:p>
+      <w:pPr>
+        <w:pStyle w:val="Heading2"/>
+      </w:pPr>
+      <w:r>
+        <w:t xml:space="preserve">ANEXO G: SOLUCIÓN WORKAROUND MÓDULO ENCUESTAS</w:t>
+      </w:r>
+    </w:p>
+    <w:p>
+      <w:pPr>
+        <w:pStyle w:val="FirstParagraph"/>
+      </w:pPr>
+      <w:r>
+        <w:rPr>
+          <w:bCs/>
+          <w:b/>
+        </w:rPr>
+        <w:t xml:space="preserve">Documento:</w:t>
+      </w:r>
+      <w:r>
+        <w:t xml:space="preserve"> </w:t>
+      </w:r>
+      <w:r>
+        <w:t xml:space="preserve">Arq. Marcelo Tunarosa | ITX | Noviembre 2024</w:t>
+      </w:r>
+    </w:p>
+    <w:p>
+      <w:pPr>
+        <w:pStyle w:val="BodyText"/>
+      </w:pPr>
+      <w:r>
+        <w:rPr>
+          <w:bCs/>
+          <w:b/>
+        </w:rPr>
+        <w:t xml:space="preserve">Contexto:</w:t>
+      </w:r>
+      <w:r>
+        <w:t xml:space="preserve"> </w:t>
+      </w:r>
+      <w:r>
+        <w:t xml:space="preserve">Necesidad de publicar una encuesta para agentes minoristas (61, 62, 63) en el Nuevo SICOM BPM. Obligatoria para diligenciar antes de acceder al sistema.</w:t>
+      </w:r>
+    </w:p>
+    <w:p>
+      <w:pPr>
+        <w:pStyle w:val="BodyText"/>
+      </w:pPr>
+      <w:r>
+        <w:rPr>
+          <w:bCs/>
+          <w:b/>
+        </w:rPr>
+        <w:t xml:space="preserve">Arquitectura:</w:t>
+      </w:r>
+      <w:r>
+        <w:t xml:space="preserve"> </w:t>
+      </w:r>
+      <w:r>
+        <w:t xml:space="preserve">- Ambiente Productivo: Encuesta integrada en flujo BPM</w:t>
+      </w:r>
+      <w:r>
+        <w:t xml:space="preserve"> </w:t>
+      </w:r>
+      <w:r>
+        <w:t xml:space="preserve">- Ambiente UAT: Pruebas de integración</w:t>
+      </w:r>
+    </w:p>
+    <w:p>
+      <w:pPr>
+        <w:pStyle w:val="BodyText"/>
+      </w:pPr>
+      <w:r>
+        <w:rPr>
+          <w:bCs/>
+          <w:b/>
+        </w:rPr>
+        <w:t xml:space="preserve">Solución General (Especialista BPM – Bizagi):</w:t>
+      </w:r>
+      <w:r>
+        <w:t xml:space="preserve"> </w:t>
+      </w:r>
+      <w:r>
+        <w:t xml:space="preserve">- Colección de Postman para consumo de la API nativa de Bizagi</w:t>
+      </w:r>
+    </w:p>
+    <w:p>
+      <w:pPr>
+        <w:pStyle w:val="BodyText"/>
+      </w:pPr>
+      <w:r>
+        <w:rPr>
+          <w:bCs/>
+          <w:b/>
+        </w:rPr>
+        <w:t xml:space="preserve">Solución Detallada (Especialista JAVA):</w:t>
+      </w:r>
+      <w:r>
+        <w:t xml:space="preserve"> </w:t>
+      </w:r>
+      <w:r>
+        <w:t xml:space="preserve">- Tabla:</w:t>
+      </w:r>
+      <w:r>
+        <w:t xml:space="preserve"> </w:t>
+      </w:r>
+      <w:r>
+        <w:rPr>
+          <w:rStyle w:val="VerbatimChar"/>
+        </w:rPr>
+        <w:t xml:space="preserve">MAE_TBL_CODIGOVERIFICACION</w:t>
+      </w:r>
+      <w:r>
+        <w:t xml:space="preserve"> </w:t>
+      </w:r>
+      <w:r>
+        <w:t xml:space="preserve">— Almacena: ID, fecha generación, código SICOM, usuario, código verificación</w:t>
+      </w:r>
+      <w:r>
+        <w:t xml:space="preserve"> </w:t>
+      </w:r>
+      <w:r>
+        <w:t xml:space="preserve">- Tabla:</w:t>
+      </w:r>
+      <w:r>
+        <w:t xml:space="preserve"> </w:t>
+      </w:r>
+      <w:r>
+        <w:rPr>
+          <w:rStyle w:val="VerbatimChar"/>
+        </w:rPr>
+        <w:t xml:space="preserve">MAE_TBL_ENCUESTA</w:t>
+      </w:r>
+      <w:r>
+        <w:t xml:space="preserve"> </w:t>
+      </w:r>
+      <w:r>
+        <w:t xml:space="preserve">— Almacena: ID, fecha registro, código SICOM, usuario, respuesta, valor, IP origen</w:t>
+      </w:r>
+      <w:r>
+        <w:t xml:space="preserve"> </w:t>
+      </w:r>
+      <w:r>
+        <w:t xml:space="preserve">- Front-end: Formulario de encuesta con validación</w:t>
+      </w:r>
+      <w:r>
+        <w:t xml:space="preserve"> </w:t>
+      </w:r>
+      <w:r>
+        <w:t xml:space="preserve">- Correo: Plantilla de notificación con código de verificación</w:t>
+      </w:r>
+    </w:p>
+    <w:p>
+      <w:r>
+        <w:pict>
+          <v:rect style="width:0;height:1.5pt" o:hralign="center" o:hrstd="t" o:hr="t"/>
+        </w:pict>
+      </w:r>
+    </w:p>
+    <w:p>
+      <w:pPr>
+        <w:pStyle w:val="FirstParagraph"/>
+      </w:pPr>
+      <w:r>
+        <w:rPr>
+          <w:bCs/>
+          <w:b/>
+        </w:rPr>
+        <w:t xml:space="preserve">Documento generado por análisis automatizado de la carpeta documental SICOM.</w:t>
+      </w:r>
+      <w:r>
+        <w:t xml:space="preserve"> </w:t>
+      </w:r>
+      <w:r>
+        <w:rPr>
+          <w:bCs/>
+          <w:b/>
+        </w:rPr>
+        <w:t xml:space="preserve">Fuentes principales:</w:t>
+      </w:r>
+      <w:r>
+        <w:t xml:space="preserve"> </w:t>
+      </w:r>
+      <w:r>
+        <w:t xml:space="preserve">M-126 (Procesos de Apoyo V6), M-127 (Procesos Core V5), M-128 (Procesos de Control V5), Manuales SIGDI, Guías SICOM, Informes de Seguridad, Documentación de Infraestructura, DRP, Actas de Comités de Control de Cambios, Roadmap de Migración a Gas, Matriz de Vulnerabilidades, Dataset Aranda, y ~40 documentos adicionales.</w:t>
+      </w:r>
+    </w:p>
+    <w:p>
+      <w:r>
+        <w:pict>
+          <v:rect style="width:0;height:1.5pt" o:hralign="center" o:hrstd="t" o:hr="t"/>
+        </w:pict>
+      </w:r>
+    </w:p>
     <w:p>
       <w:pPr>
         <w:pStyle w:val="BlockText"/>
@@ -13108,8 +16345,8 @@
         <w:t xml:space="preserve">Análisis documental profundo — SICOM Ministerio de Minas y Energía</w:t>
       </w:r>
     </w:p>
-    <w:bookmarkEnd w:id="96"/>
-    <w:bookmarkEnd w:id="97"/>
+    <w:bookmarkEnd w:id="103"/>
+    <w:bookmarkEnd w:id="104"/>
     <w:sectPr/>
   </w:body>
 </w:document>

</xml_diff>

<commit_message>
Super Documento SICOM v1.2 - Anexo H: Listado General de Requerimientos (HU) completado
</commit_message>
<xml_diff>
--- a/PROYECTO-002-2026-SICOM/Super_Documento_SICOM.docx
+++ b/PROYECTO-002-2026-SICOM/Super_Documento_SICOM.docx
@@ -28,7 +28,7 @@
         </w:p>
       </w:sdtContent>
     </w:sdt>
-    <w:bookmarkStart w:id="104" w:name="Xb8d68de061527f8697c4f5bcbda320515f6bafa"/>
+    <w:bookmarkStart w:id="105" w:name="Xb8d68de061527f8697c4f5bcbda320515f6bafa"/>
     <w:p>
       <w:pPr>
         <w:pStyle w:val="Heading1"/>
@@ -16310,6 +16310,789 @@
         <w:t xml:space="preserve">M-126 (Procesos de Apoyo V6), M-127 (Procesos Core V5), M-128 (Procesos de Control V5), Manuales SIGDI, Guías SICOM, Informes de Seguridad, Documentación de Infraestructura, DRP, Actas de Comités de Control de Cambios, Roadmap de Migración a Gas, Matriz de Vulnerabilidades, Dataset Aranda, y ~40 documentos adicionales.</w:t>
       </w:r>
     </w:p>
+    <w:bookmarkEnd w:id="103"/>
+    <w:bookmarkStart w:id="104" w:name="Xc08de4a64c51d9633c47f872568cab0244d761f"/>
+    <w:p>
+      <w:pPr>
+        <w:pStyle w:val="Heading2"/>
+      </w:pPr>
+      <w:r>
+        <w:t xml:space="preserve">ANEXO H: LISTADO GENERAL DE REQUERIMIENTOS SICOM LÍQUIDOS</w:t>
+      </w:r>
+    </w:p>
+    <w:p>
+      <w:pPr>
+        <w:pStyle w:val="FirstParagraph"/>
+      </w:pPr>
+      <w:r>
+        <w:rPr>
+          <w:bCs/>
+          <w:b/>
+        </w:rPr>
+        <w:t xml:space="preserve">Documento:</w:t>
+      </w:r>
+      <w:r>
+        <w:t xml:space="preserve"> </w:t>
+      </w:r>
+      <w:r>
+        <w:t xml:space="preserve">Listado General de Requerimientos SICOM Líquidos — MME (Octubre 2025)</w:t>
+      </w:r>
+    </w:p>
+    <w:p>
+      <w:pPr>
+        <w:pStyle w:val="BodyText"/>
+      </w:pPr>
+      <w:r>
+        <w:rPr>
+          <w:bCs/>
+          <w:b/>
+        </w:rPr>
+        <w:t xml:space="preserve">Resumen de Historias de Usuario:</w:t>
+      </w:r>
+    </w:p>
+    <w:tbl>
+      <w:tblPr>
+        <w:tblStyle w:val="Table"/>
+        <w:tblW w:type="pct" w:w="5000"/>
+        <w:tblLook w:firstRow="1" w:lastRow="0" w:firstColumn="0" w:lastColumn="0" w:noHBand="0" w:noVBand="0" w:val="0020"/>
+        <w:jc w:val="start"/>
+      </w:tblPr>
+      <w:tblGrid>
+        <w:gridCol w:w="1131"/>
+        <w:gridCol w:w="1131"/>
+        <w:gridCol w:w="1272"/>
+        <w:gridCol w:w="1131"/>
+        <w:gridCol w:w="1131"/>
+        <w:gridCol w:w="2121"/>
+      </w:tblGrid>
+      <w:tr>
+        <w:trPr>
+          <w:tblHeader w:val="true"/>
+        </w:trPr>
+        <w:tc>
+          <w:tcPr/>
+          <w:p>
+            <w:pPr>
+              <w:pStyle w:val="Compact"/>
+              <w:jc w:val="left"/>
+            </w:pPr>
+            <w:r>
+              <w:t xml:space="preserve">NÚMERO</w:t>
+            </w:r>
+          </w:p>
+        </w:tc>
+        <w:tc>
+          <w:tcPr/>
+          <w:p>
+            <w:pPr>
+              <w:pStyle w:val="Compact"/>
+              <w:jc w:val="left"/>
+            </w:pPr>
+            <w:r>
+              <w:t xml:space="preserve">NOMBRE</w:t>
+            </w:r>
+          </w:p>
+        </w:tc>
+        <w:tc>
+          <w:tcPr/>
+          <w:p>
+            <w:pPr>
+              <w:pStyle w:val="Compact"/>
+              <w:jc w:val="left"/>
+            </w:pPr>
+            <w:r>
+              <w:t xml:space="preserve">SISTEMA</w:t>
+            </w:r>
+          </w:p>
+        </w:tc>
+        <w:tc>
+          <w:tcPr/>
+          <w:p>
+            <w:pPr>
+              <w:pStyle w:val="Compact"/>
+              <w:jc w:val="left"/>
+            </w:pPr>
+            <w:r>
+              <w:t xml:space="preserve">ESTADO</w:t>
+            </w:r>
+          </w:p>
+        </w:tc>
+        <w:tc>
+          <w:tcPr/>
+          <w:p>
+            <w:pPr>
+              <w:pStyle w:val="Compact"/>
+              <w:jc w:val="left"/>
+            </w:pPr>
+            <w:r>
+              <w:t xml:space="preserve">ORIGEN</w:t>
+            </w:r>
+          </w:p>
+        </w:tc>
+        <w:tc>
+          <w:tcPr/>
+          <w:p>
+            <w:pPr>
+              <w:pStyle w:val="Compact"/>
+              <w:jc w:val="left"/>
+            </w:pPr>
+            <w:r>
+              <w:t xml:space="preserve">FUNCIONAL MME</w:t>
+            </w:r>
+          </w:p>
+        </w:tc>
+      </w:tr>
+      <w:tr>
+        <w:tc>
+          <w:tcPr/>
+          <w:p>
+            <w:pPr>
+              <w:pStyle w:val="Compact"/>
+              <w:jc w:val="left"/>
+            </w:pPr>
+            <w:r>
+              <w:t xml:space="preserve">344</w:t>
+            </w:r>
+          </w:p>
+        </w:tc>
+        <w:tc>
+          <w:tcPr/>
+          <w:p>
+            <w:pPr>
+              <w:pStyle w:val="Compact"/>
+              <w:jc w:val="left"/>
+            </w:pPr>
+            <w:r>
+              <w:t xml:space="preserve">Validación Vehículos Comercializadores Industriales y EDS de Zona de Frontera</w:t>
+            </w:r>
+          </w:p>
+        </w:tc>
+        <w:tc>
+          <w:tcPr/>
+          <w:p>
+            <w:pPr>
+              <w:pStyle w:val="Compact"/>
+              <w:jc w:val="left"/>
+            </w:pPr>
+            <w:r>
+              <w:t xml:space="preserve">NUEVO SICOM LIQUIDOS</w:t>
+            </w:r>
+          </w:p>
+        </w:tc>
+        <w:tc>
+          <w:tcPr/>
+          <w:p>
+            <w:pPr>
+              <w:pStyle w:val="Compact"/>
+              <w:jc w:val="left"/>
+            </w:pPr>
+            <w:r>
+              <w:t xml:space="preserve">EN PRODUCCIÓN</w:t>
+            </w:r>
+          </w:p>
+        </w:tc>
+        <w:tc>
+          <w:tcPr/>
+          <w:p>
+            <w:pPr>
+              <w:pStyle w:val="Compact"/>
+              <w:jc w:val="left"/>
+            </w:pPr>
+            <w:r>
+              <w:t xml:space="preserve">Migración Java a Bizagi</w:t>
+            </w:r>
+          </w:p>
+        </w:tc>
+        <w:tc>
+          <w:tcPr/>
+          <w:p>
+            <w:pPr>
+              <w:pStyle w:val="Compact"/>
+              <w:jc w:val="left"/>
+            </w:pPr>
+            <w:r>
+              <w:t xml:space="preserve">DIANA RUIZ</w:t>
+            </w:r>
+          </w:p>
+        </w:tc>
+      </w:tr>
+      <w:tr>
+        <w:tc>
+          <w:tcPr/>
+          <w:p>
+            <w:pPr>
+              <w:pStyle w:val="Compact"/>
+              <w:jc w:val="left"/>
+            </w:pPr>
+            <w:r>
+              <w:t xml:space="preserve">360</w:t>
+            </w:r>
+          </w:p>
+        </w:tc>
+        <w:tc>
+          <w:tcPr/>
+          <w:p>
+            <w:pPr>
+              <w:pStyle w:val="Compact"/>
+              <w:jc w:val="left"/>
+            </w:pPr>
+            <w:r>
+              <w:t xml:space="preserve">Actualización de Cupos OPAI proceso ACOP</w:t>
+            </w:r>
+          </w:p>
+        </w:tc>
+        <w:tc>
+          <w:tcPr/>
+          <w:p>
+            <w:pPr>
+              <w:pStyle w:val="Compact"/>
+              <w:jc w:val="left"/>
+            </w:pPr>
+            <w:r>
+              <w:t xml:space="preserve">NUEVO SICOM LIQUIDOS</w:t>
+            </w:r>
+          </w:p>
+        </w:tc>
+        <w:tc>
+          <w:tcPr/>
+          <w:p>
+            <w:pPr>
+              <w:pStyle w:val="Compact"/>
+              <w:jc w:val="left"/>
+            </w:pPr>
+            <w:r>
+              <w:t xml:space="preserve">SIN FIRMA</w:t>
+            </w:r>
+          </w:p>
+        </w:tc>
+        <w:tc>
+          <w:tcPr/>
+          <w:p>
+            <w:pPr>
+              <w:pStyle w:val="Compact"/>
+              <w:jc w:val="left"/>
+            </w:pPr>
+            <w:r>
+              <w:t xml:space="preserve">Evolutivos / Rediseños</w:t>
+            </w:r>
+          </w:p>
+        </w:tc>
+        <w:tc>
+          <w:tcPr/>
+          <w:p>
+            <w:pPr>
+              <w:pStyle w:val="Compact"/>
+              <w:jc w:val="left"/>
+            </w:pPr>
+            <w:r>
+              <w:t xml:space="preserve">ANGIE KATHERINE MEJIA GONZALEZ</w:t>
+            </w:r>
+          </w:p>
+        </w:tc>
+      </w:tr>
+      <w:tr>
+        <w:tc>
+          <w:tcPr/>
+          <w:p>
+            <w:pPr>
+              <w:pStyle w:val="Compact"/>
+              <w:jc w:val="left"/>
+            </w:pPr>
+            <w:r>
+              <w:t xml:space="preserve">1206</w:t>
+            </w:r>
+          </w:p>
+        </w:tc>
+        <w:tc>
+          <w:tcPr/>
+          <w:p>
+            <w:pPr>
+              <w:pStyle w:val="Compact"/>
+              <w:jc w:val="left"/>
+            </w:pPr>
+            <w:r>
+              <w:t xml:space="preserve">Creación Jobs y Campos Comercializador Industrial</w:t>
+            </w:r>
+          </w:p>
+        </w:tc>
+        <w:tc>
+          <w:tcPr/>
+          <w:p>
+            <w:pPr>
+              <w:pStyle w:val="Compact"/>
+              <w:jc w:val="left"/>
+            </w:pPr>
+            <w:r>
+              <w:t xml:space="preserve">NUEVO SICOM LIQUIDOS</w:t>
+            </w:r>
+          </w:p>
+        </w:tc>
+        <w:tc>
+          <w:tcPr/>
+          <w:p>
+            <w:pPr>
+              <w:pStyle w:val="Compact"/>
+              <w:jc w:val="left"/>
+            </w:pPr>
+            <w:r>
+              <w:t xml:space="preserve">EN BACKLOG</w:t>
+            </w:r>
+          </w:p>
+        </w:tc>
+        <w:tc>
+          <w:tcPr/>
+          <w:p>
+            <w:pPr>
+              <w:pStyle w:val="Compact"/>
+              <w:jc w:val="left"/>
+            </w:pPr>
+            <w:r>
+              <w:t xml:space="preserve">Migración Java a Bizagi</w:t>
+            </w:r>
+          </w:p>
+        </w:tc>
+        <w:tc>
+          <w:tcPr/>
+          <w:p>
+            <w:pPr>
+              <w:pStyle w:val="Compact"/>
+              <w:jc w:val="left"/>
+            </w:pPr>
+            <w:r>
+              <w:t xml:space="preserve">PABLO TORRES</w:t>
+            </w:r>
+          </w:p>
+        </w:tc>
+      </w:tr>
+      <w:tr>
+        <w:tc>
+          <w:tcPr/>
+          <w:p>
+            <w:pPr>
+              <w:pStyle w:val="Compact"/>
+              <w:jc w:val="left"/>
+            </w:pPr>
+            <w:r>
+              <w:t xml:space="preserve">1212</w:t>
+            </w:r>
+          </w:p>
+        </w:tc>
+        <w:tc>
+          <w:tcPr/>
+          <w:p>
+            <w:pPr>
+              <w:pStyle w:val="Compact"/>
+              <w:jc w:val="left"/>
+            </w:pPr>
+            <w:r>
+              <w:t xml:space="preserve">Ajustes Comercializador Industrial – Excepciones y Direcciones Cliente Final</w:t>
+            </w:r>
+          </w:p>
+        </w:tc>
+        <w:tc>
+          <w:tcPr/>
+          <w:p>
+            <w:pPr>
+              <w:pStyle w:val="Compact"/>
+              <w:jc w:val="left"/>
+            </w:pPr>
+            <w:r>
+              <w:t xml:space="preserve">NUEVO SICOM LIQUIDOS</w:t>
+            </w:r>
+          </w:p>
+        </w:tc>
+        <w:tc>
+          <w:tcPr/>
+          <w:p>
+            <w:pPr>
+              <w:pStyle w:val="Compact"/>
+              <w:jc w:val="left"/>
+            </w:pPr>
+            <w:r>
+              <w:t xml:space="preserve">EN DESARROLLO</w:t>
+            </w:r>
+          </w:p>
+        </w:tc>
+        <w:tc>
+          <w:tcPr/>
+          <w:p>
+            <w:pPr>
+              <w:pStyle w:val="Compact"/>
+              <w:jc w:val="left"/>
+            </w:pPr>
+            <w:r>
+              <w:t xml:space="preserve">Migración Java a Bizagi</w:t>
+            </w:r>
+          </w:p>
+        </w:tc>
+        <w:tc>
+          <w:tcPr/>
+          <w:p>
+            <w:pPr>
+              <w:pStyle w:val="Compact"/>
+              <w:jc w:val="left"/>
+            </w:pPr>
+            <w:r>
+              <w:t xml:space="preserve">PABLO TORRES</w:t>
+            </w:r>
+          </w:p>
+        </w:tc>
+      </w:tr>
+      <w:tr>
+        <w:tc>
+          <w:tcPr/>
+          <w:p>
+            <w:pPr>
+              <w:pStyle w:val="Compact"/>
+              <w:jc w:val="left"/>
+            </w:pPr>
+            <w:r>
+              <w:t xml:space="preserve">1993</w:t>
+            </w:r>
+          </w:p>
+        </w:tc>
+        <w:tc>
+          <w:tcPr/>
+          <w:p>
+            <w:pPr>
+              <w:pStyle w:val="Compact"/>
+              <w:jc w:val="left"/>
+            </w:pPr>
+            <w:r>
+              <w:t xml:space="preserve">Cierre, Anulación y Rechazo Guía de OPP</w:t>
+            </w:r>
+          </w:p>
+        </w:tc>
+        <w:tc>
+          <w:tcPr/>
+          <w:p>
+            <w:pPr>
+              <w:pStyle w:val="Compact"/>
+              <w:jc w:val="left"/>
+            </w:pPr>
+            <w:r>
+              <w:t xml:space="preserve">SIGDI</w:t>
+            </w:r>
+          </w:p>
+        </w:tc>
+        <w:tc>
+          <w:tcPr/>
+          <w:p>
+            <w:pPr>
+              <w:pStyle w:val="Compact"/>
+              <w:jc w:val="left"/>
+            </w:pPr>
+            <w:r>
+              <w:t xml:space="preserve">EN DESARROLLO</w:t>
+            </w:r>
+          </w:p>
+        </w:tc>
+        <w:tc>
+          <w:tcPr/>
+          <w:p>
+            <w:pPr>
+              <w:pStyle w:val="Compact"/>
+              <w:jc w:val="left"/>
+            </w:pPr>
+            <w:r>
+              <w:t xml:space="preserve">Evolutivos / Rediseños</w:t>
+            </w:r>
+          </w:p>
+        </w:tc>
+        <w:tc>
+          <w:tcPr/>
+          <w:p>
+            <w:pPr>
+              <w:pStyle w:val="Compact"/>
+              <w:jc w:val="left"/>
+            </w:pPr>
+            <w:r>
+              <w:t xml:space="preserve">NICOLAS LEIVA</w:t>
+            </w:r>
+          </w:p>
+        </w:tc>
+      </w:tr>
+      <w:tr>
+        <w:tc>
+          <w:tcPr/>
+          <w:p>
+            <w:pPr>
+              <w:pStyle w:val="Compact"/>
+              <w:jc w:val="left"/>
+            </w:pPr>
+            <w:r>
+              <w:t xml:space="preserve">1531</w:t>
+            </w:r>
+          </w:p>
+        </w:tc>
+        <w:tc>
+          <w:tcPr/>
+          <w:p>
+            <w:pPr>
+              <w:pStyle w:val="Compact"/>
+              <w:jc w:val="left"/>
+            </w:pPr>
+            <w:r>
+              <w:t xml:space="preserve">Proceso de Configuración Contingencias (Plantas)</w:t>
+            </w:r>
+          </w:p>
+        </w:tc>
+        <w:tc>
+          <w:tcPr/>
+          <w:p>
+            <w:pPr>
+              <w:pStyle w:val="Compact"/>
+              <w:jc w:val="left"/>
+            </w:pPr>
+            <w:r>
+              <w:t xml:space="preserve">NUEVO SICOM LIQUIDOS</w:t>
+            </w:r>
+          </w:p>
+        </w:tc>
+        <w:tc>
+          <w:tcPr/>
+          <w:p>
+            <w:pPr>
+              <w:pStyle w:val="Compact"/>
+              <w:jc w:val="left"/>
+            </w:pPr>
+            <w:r>
+              <w:t xml:space="preserve">CERTIFICACION FUNCIONAL</w:t>
+            </w:r>
+          </w:p>
+        </w:tc>
+        <w:tc>
+          <w:tcPr/>
+          <w:p>
+            <w:pPr>
+              <w:pStyle w:val="Compact"/>
+              <w:jc w:val="left"/>
+            </w:pPr>
+            <w:r>
+              <w:t xml:space="preserve">Evolutivos / Rediseños</w:t>
+            </w:r>
+          </w:p>
+        </w:tc>
+        <w:tc>
+          <w:tcPr/>
+          <w:p>
+            <w:pPr>
+              <w:pStyle w:val="Compact"/>
+              <w:jc w:val="left"/>
+            </w:pPr>
+            <w:r>
+              <w:t xml:space="preserve">MAIDA EUNISE HERRERA</w:t>
+            </w:r>
+          </w:p>
+        </w:tc>
+      </w:tr>
+    </w:tbl>
+    <w:p>
+      <w:pPr>
+        <w:pStyle w:val="BodyText"/>
+      </w:pPr>
+      <w:r>
+        <w:rPr>
+          <w:bCs/>
+          <w:b/>
+        </w:rPr>
+        <w:t xml:space="preserve">Estados de HU:</w:t>
+      </w:r>
+      <w:r>
+        <w:t xml:space="preserve"> </w:t>
+      </w:r>
+      <w:r>
+        <w:t xml:space="preserve">-</w:t>
+      </w:r>
+      <w:r>
+        <w:t xml:space="preserve"> </w:t>
+      </w:r>
+      <w:r>
+        <w:rPr>
+          <w:bCs/>
+          <w:b/>
+        </w:rPr>
+        <w:t xml:space="preserve">EN PRODUCCIÓN:</w:t>
+      </w:r>
+      <w:r>
+        <w:t xml:space="preserve"> </w:t>
+      </w:r>
+      <w:r>
+        <w:t xml:space="preserve">Desplegadas y operativas</w:t>
+      </w:r>
+      <w:r>
+        <w:t xml:space="preserve"> </w:t>
+      </w:r>
+      <w:r>
+        <w:t xml:space="preserve">-</w:t>
+      </w:r>
+      <w:r>
+        <w:t xml:space="preserve"> </w:t>
+      </w:r>
+      <w:r>
+        <w:rPr>
+          <w:bCs/>
+          <w:b/>
+        </w:rPr>
+        <w:t xml:space="preserve">EN DESARROLLO:</w:t>
+      </w:r>
+      <w:r>
+        <w:t xml:space="preserve"> </w:t>
+      </w:r>
+      <w:r>
+        <w:t xml:space="preserve">En construcción</w:t>
+      </w:r>
+      <w:r>
+        <w:t xml:space="preserve"> </w:t>
+      </w:r>
+      <w:r>
+        <w:t xml:space="preserve">-</w:t>
+      </w:r>
+      <w:r>
+        <w:t xml:space="preserve"> </w:t>
+      </w:r>
+      <w:r>
+        <w:rPr>
+          <w:bCs/>
+          <w:b/>
+        </w:rPr>
+        <w:t xml:space="preserve">EN BACKLOG:</w:t>
+      </w:r>
+      <w:r>
+        <w:t xml:space="preserve"> </w:t>
+      </w:r>
+      <w:r>
+        <w:t xml:space="preserve">Pendientes de iniciar</w:t>
+      </w:r>
+      <w:r>
+        <w:t xml:space="preserve"> </w:t>
+      </w:r>
+      <w:r>
+        <w:t xml:space="preserve">-</w:t>
+      </w:r>
+      <w:r>
+        <w:t xml:space="preserve"> </w:t>
+      </w:r>
+      <w:r>
+        <w:rPr>
+          <w:bCs/>
+          <w:b/>
+        </w:rPr>
+        <w:t xml:space="preserve">SIN FIRMA:</w:t>
+      </w:r>
+      <w:r>
+        <w:t xml:space="preserve"> </w:t>
+      </w:r>
+      <w:r>
+        <w:t xml:space="preserve">Requieren aprobación formal del MME</w:t>
+      </w:r>
+      <w:r>
+        <w:t xml:space="preserve"> </w:t>
+      </w:r>
+      <w:r>
+        <w:t xml:space="preserve">-</w:t>
+      </w:r>
+      <w:r>
+        <w:t xml:space="preserve"> </w:t>
+      </w:r>
+      <w:r>
+        <w:rPr>
+          <w:bCs/>
+          <w:b/>
+        </w:rPr>
+        <w:t xml:space="preserve">PENDIENTE PASO A PRODUCCIÓN:</w:t>
+      </w:r>
+      <w:r>
+        <w:t xml:space="preserve"> </w:t>
+      </w:r>
+      <w:r>
+        <w:t xml:space="preserve">En pruebas finales</w:t>
+      </w:r>
+    </w:p>
+    <w:p>
+      <w:pPr>
+        <w:pStyle w:val="BodyText"/>
+      </w:pPr>
+      <w:r>
+        <w:rPr>
+          <w:bCs/>
+          <w:b/>
+        </w:rPr>
+        <w:t xml:space="preserve">Funcionales MME asignados:</w:t>
+      </w:r>
+      <w:r>
+        <w:t xml:space="preserve"> </w:t>
+      </w:r>
+      <w:r>
+        <w:t xml:space="preserve">- DIANA RUIZ</w:t>
+      </w:r>
+      <w:r>
+        <w:t xml:space="preserve"> </w:t>
+      </w:r>
+      <w:r>
+        <w:t xml:space="preserve">- ANGIE KATHERINE MEJIA GONZALEZ</w:t>
+      </w:r>
+      <w:r>
+        <w:t xml:space="preserve"> </w:t>
+      </w:r>
+      <w:r>
+        <w:t xml:space="preserve">- PABLO TORRES</w:t>
+      </w:r>
+      <w:r>
+        <w:t xml:space="preserve"> </w:t>
+      </w:r>
+      <w:r>
+        <w:t xml:space="preserve">- NICOLAS LEIVA</w:t>
+      </w:r>
+      <w:r>
+        <w:t xml:space="preserve"> </w:t>
+      </w:r>
+      <w:r>
+        <w:t xml:space="preserve">- MAIDA EUNISE HERRERA</w:t>
+      </w:r>
+      <w:r>
+        <w:t xml:space="preserve"> </w:t>
+      </w:r>
+      <w:r>
+        <w:t xml:space="preserve">- EMMA JIMENEZ</w:t>
+      </w:r>
+      <w:r>
+        <w:t xml:space="preserve"> </w:t>
+      </w:r>
+      <w:r>
+        <w:t xml:space="preserve">- JHON JAIRO</w:t>
+      </w:r>
+      <w:r>
+        <w:t xml:space="preserve"> </w:t>
+      </w:r>
+      <w:r>
+        <w:t xml:space="preserve">- NELLY RIOS</w:t>
+      </w:r>
+      <w:r>
+        <w:t xml:space="preserve"> </w:t>
+      </w:r>
+      <w:r>
+        <w:t xml:space="preserve">- NICOLAS CALDERÓN ACHURY</w:t>
+      </w:r>
+      <w:r>
+        <w:t xml:space="preserve"> </w:t>
+      </w:r>
+      <w:r>
+        <w:t xml:space="preserve">- DEYSI RODRIGUEZ BERRIO (Grupo Precios)</w:t>
+      </w:r>
+      <w:r>
+        <w:t xml:space="preserve"> </w:t>
+      </w:r>
+      <w:r>
+        <w:t xml:space="preserve">- HECTOR EMILIO MORENO</w:t>
+      </w:r>
+      <w:r>
+        <w:t xml:space="preserve"> </w:t>
+      </w:r>
+      <w:r>
+        <w:t xml:space="preserve">- JOSE DANIEL TULCAN</w:t>
+      </w:r>
+    </w:p>
     <w:p>
       <w:r>
         <w:pict>
@@ -16319,13 +17102,48 @@
     </w:p>
     <w:p>
       <w:pPr>
-        <w:pStyle w:val="BlockText"/>
+        <w:pStyle w:val="FirstParagraph"/>
       </w:pPr>
       <w:r>
         <w:rPr>
           <w:bCs/>
           <w:b/>
         </w:rPr>
+        <w:t xml:space="preserve">Documento generado por análisis automatizado de la carpeta documental SICOM.</w:t>
+      </w:r>
+      <w:r>
+        <w:t xml:space="preserve"> </w:t>
+      </w:r>
+      <w:r>
+        <w:rPr>
+          <w:bCs/>
+          <w:b/>
+        </w:rPr>
+        <w:t xml:space="preserve">Fuentes principales:</w:t>
+      </w:r>
+      <w:r>
+        <w:t xml:space="preserve"> </w:t>
+      </w:r>
+      <w:r>
+        <w:t xml:space="preserve">M-126 (Procesos de Apoyo V6), M-127 (Procesos Core V5), M-128 (Procesos de Control V5), Manuales SIGDI, Guías SICOM, Informes de Seguridad, Documentación de Infraestructura, DRP, Actas de Comités de Control de Cambios, Roadmap de Migración a Gas, Matriz de Vulnerabilidades, Dataset Aranda, Listado General de Requerimientos, y ~40 documentos adicionales.</w:t>
+      </w:r>
+    </w:p>
+    <w:p>
+      <w:r>
+        <w:pict>
+          <v:rect style="width:0;height:1.5pt" o:hralign="center" o:hrstd="t" o:hr="t"/>
+        </w:pict>
+      </w:r>
+    </w:p>
+    <w:p>
+      <w:pPr>
+        <w:pStyle w:val="BlockText"/>
+      </w:pPr>
+      <w:r>
+        <w:rPr>
+          <w:bCs/>
+          <w:b/>
+        </w:rPr>
         <w:t xml:space="preserve">ZEUS</w:t>
       </w:r>
       <w:r>
@@ -16345,8 +17163,8 @@
         <w:t xml:space="preserve">Análisis documental profundo — SICOM Ministerio de Minas y Energía</w:t>
       </w:r>
     </w:p>
-    <w:bookmarkEnd w:id="103"/>
     <w:bookmarkEnd w:id="104"/>
+    <w:bookmarkEnd w:id="105"/>
     <w:sectPr/>
   </w:body>
 </w:document>

</xml_diff>